<commit_message>
Artigo v4: estudo de caso metodológico e institucional, pilares com equações e mapas, diagramas editáveis em tabela, posição estadual, fluxo financeiro, revisão do PPA
Co-Authored-By: Claude Fable 5.1 <noreply@anthropic.com>
Claude-Session: https://claude.ai/code/session_01MDzyNreLrve5brDgfNKZ3e
</commit_message>
<xml_diff>
--- a/creches-parana/08_artigo/artigo_creches_parana_anonimizado.docx
+++ b/creches-parana/08_artigo/artigo_creches_parana_anonimizado.docx
@@ -84,7 +84,7 @@
           <w:i w:val="0"/>
           <w:sz w:val="24"/>
         </w:rPr>
-        <w:t>Este artigo reconstrói, sistematiza e analisa a metodologia que converteu evidências municipais em uma regra efetiva de alocação de infraestrutura social: a distribuição de cerca de 300 creches financiadas pelo Governo do Paraná entre os 399 municípios do estado, no Programa Infância Feliz Paraná (Lei Estadual nº 21.870/2023). O Potencial de Creche por Município (PCM) combina nove indicadores oficiais em três pilares (educacional, demográfico e socioeconômico), normalizados pelo método mínimo-máximo e agregados com pesos 2, 1 e 2. Integrado a faixas de porte, cotas, tetos e arredondamento pelo maior resto, o índice foi aprovado pelo conselho estadual de direitos e publicado com a lista de municípios elegíveis, o que lhe deu impacto alocativo direto sobre a seleção territorial do investimento. A avaliação ex ante da regra, baseada em reconstrução documental, auditoria das planilhas e análise de sensibilidade, mostra que o ordenamento é estável a variações de pesos e de normalização (correlações de postos de 0,93 a 0,97) e que a regra adotada contemplou 258 municípios com 300 unidades, contra 147 municípios sob critério populacional e 300 municípios, sem as capitais regionais, sob ranqueamento puro, mantendo 89% das crianças de zero a quatro anos em municípios contemplados. O desenho metodológico definiu a territorialização da política; seus efeitos sociais posteriores cabem a uma avaliação ex post.</w:t>
+        <w:t>Este artigo reconstrói, sistematiza e analisa a metodologia que converteu evidências municipais em uma regra efetiva de alocação de infraestrutura social: a distribuição de cerca de 300 creches financiadas pelo Governo do Paraná entre os 399 municípios do estado, no Programa Infância Feliz Paraná (Lei Estadual nº 21.870/2023). O Potencial de Creche por Município (PCM) combina nove indicadores oficiais em três pilares (educacional, demográfico e socioeconômico), normalizados pelo método mínimo-máximo e agregados com pesos 2, 1 e 2. Integrado a faixas de porte, cotas, tetos e arredondamento pelo maior resto, o índice foi aprovado pelo conselho estadual de direitos e publicado com a lista de municípios elegíveis, com impacto alocativo direto sobre a seleção territorial do investimento. A avaliação ex ante da regra, por reconstrução documental, auditoria das planilhas e análise de sensibilidade, mostra ordenamento estável a pesos e normalização (correlações de postos de 0,93 a 0,97) e uma regra que contemplou 258 municípios com 300 unidades, contra 147 sob critério populacional, mantendo 89% das crianças de zero a quatro anos em municípios contemplados. O desenho metodológico definiu a territorialização da política; seus efeitos sociais cabem a uma avaliação ex post.</w:t>
       </w:r>
     </w:p>
     <w:p>
@@ -135,7 +135,7 @@
           <w:i w:val="0"/>
           <w:sz w:val="24"/>
         </w:rPr>
-        <w:t>This article reconstructs, systematizes and analyzes the methodology that converted municipal evidence into an effective rule for allocating social infrastructure: the distribution of about 300 childcare centers funded by the State of Paraná among its 399 municipalities under the Infância Feliz Paraná Program (State Law 21,870/2023). The Childcare Potential by Municipality (PCM) combines nine official indicators in three pillars (educational, demographic and socioeconomic), normalized by the min-max method and aggregated with weights 2, 1 and 2. Integrated with size bands, quotas, caps and largest-remainder rounding, the index was approved by the state rights council and published with the list of eligible municipalities, which gave it a direct allocative impact on the territorial selection of the investment. The ex ante evaluation of the rule, based on documentary reconstruction, spreadsheet auditing and sensitivity analysis, shows that the ranking is stable to changes in weights and normalization (rank correlations of 0.93 to 0.97) and that the adopted rule reached 258 municipalities with 300 units, against 147 municipalities under a population criterion and 300 municipalities, without the regional capitals, under pure ranking, while keeping 89% of children aged zero to four in covered municipalities. The methodological design defined the territorialization of the policy; its later social effects belong to an ex post evaluation.</w:t>
+        <w:t>This article reconstructs, systematizes and analyzes the methodology that converted municipal evidence into an effective rule for allocating social infrastructure: the distribution of about 300 childcare centers funded by the State of Paraná among its 399 municipalities under the Infância Feliz Paraná Program (State Law 21,870/2023). The Childcare Potential by Municipality (PCM) combines nine official indicators in three pillars (educational, demographic and socioeconomic), normalized by the min-max method and aggregated with weights 2, 1 and 2. Integrated with size bands, quotas, caps and largest-remainder rounding, the index was approved by the state rights council and published with the list of eligible municipalities, with a direct allocative impact on the territorial selection of the investment. The ex ante evaluation of the rule, through documentary reconstruction, spreadsheet auditing and sensitivity analysis, shows a ranking that is stable to weights and normalization (rank correlations of 0.93 to 0.97) and a rule that reached 258 municipalities with 300 units, against 147 under a population criterion, while keeping 89% of children aged zero to four in covered municipalities. The methodological design defined the territorialization of the policy; its social effects belong to an ex post evaluation.</w:t>
       </w:r>
     </w:p>
     <w:p>
@@ -186,7 +186,7 @@
           <w:i w:val="0"/>
           <w:sz w:val="24"/>
         </w:rPr>
-        <w:t>Este artículo reconstruye, sistematiza y analiza la metodología que convirtió evidencias municipales en una regla efectiva de asignación de infraestructura social: la distribución de cerca de 300 guarderías financiadas por el Gobierno de Paraná entre los 399 municipios del estado, en el Programa Infância Feliz Paraná (Ley Estadual 21.870/2023). El Potencial de Guardería por Municipio (PCM) combina nueve indicadores oficiales en tres pilares (educativo, demográfico y socioeconómico), normalizados por el método mínimo-máximo y agregados con pesos 2, 1 y 2. Integrado a franjas de tamaño, cuotas, topes y redondeo por mayor resto, el índice fue aprobado por el consejo estadual de derechos y publicado con la lista de municipios elegibles, lo que le dio impacto asignativo directo sobre la selección territorial de la inversión. La evaluación ex ante de la regla, basada en reconstrucción documental, auditoría de las planillas y análisis de sensibilidad, muestra que el ordenamiento es estable a variaciones de pesos y normalización (correlaciones de rangos de 0,93 a 0,97) y que la regla adoptada alcanzó 258 municipios con 300 unidades, frente a 147 municipios bajo un criterio poblacional y 300 municipios, sin las capitales regionales, bajo ranking puro, manteniendo al 89% de los niños de cero a cuatro años en municipios contemplados. El diseño metodológico definió la territorialización de la política; sus efectos sociales posteriores corresponden a una evaluación ex post.</w:t>
+        <w:t>Este artículo reconstruye, sistematiza y analiza la metodología que convirtió evidencias municipales en una regla efectiva de asignación de infraestructura social: la distribución de cerca de 300 guarderías financiadas por el Gobierno de Paraná entre los 399 municipios del estado, en el Programa Infância Feliz Paraná (Ley Estadual 21.870/2023). El Potencial de Guardería por Municipio (PCM) combina nueve indicadores oficiales en tres pilares (educativo, demográfico y socioeconómico), normalizados por el método mínimo-máximo y agregados con pesos 2, 1 y 2. Integrado a franjas de tamaño, cuotas, topes y redondeo por mayor resto, el índice fue aprobado por el consejo estadual de derechos y publicado con la lista de municipios elegibles, con impacto asignativo directo sobre la selección territorial de la inversión. La evaluación ex ante de la regla, por reconstrucción documental, auditoría de las planillas y análisis de sensibilidad, muestra un ordenamiento estable a pesos y normalización (correlaciones de rangos de 0,93 a 0,97) y una regla que alcanzó 258 municipios con 300 unidades, frente a 147 bajo un criterio poblacional, manteniendo al 89% de los niños de cero a cuatro años en municipios contemplados. El diseño metodológico definió la territorialización de la política; sus efectos sociales corresponden a una evaluación ex post.</w:t>
       </w:r>
     </w:p>
     <w:p>
@@ -236,7 +236,7 @@
           <w:i w:val="0"/>
           <w:sz w:val="24"/>
         </w:rPr>
-        <w:t>A economia do bem-estar atribui ao Estado uma função alocativa: prover, ou induzir a provisão de, bens que o mercado ofereceria em quantidade inferior à socialmente desejável (MUSGRAVE; MUSGRAVE, 1980, p. 6-7). A creche é um desses bens. Seus benefícios extravasam a família, na forma de participação materna no trabalho e de desenvolvimento infantil convertido em capacidade produtiva futura, e as famílias de menor renda, que menos podem pagar por vagas privadas, são as que mais se beneficiam do acesso (ATTANASIO; CATTAN; MEGHIR, 2022). Por isso a construção de creches pertence à infraestrutura social, entendida como o conjunto de equipamentos físicos e serviços de longa duração, como escolas, creches, unidades de saúde e habitação social, que sustentam o bem-estar e a capacidade produtiva de uma população (FRANSEN; DEL BUFALO; REVIGLIO, 2018, p. 8). Diferentemente de uma transferência monetária, o equipamento é fixo e indivisível: sua localização decide quem terá acesso ao serviço por décadas, e a decisão de onde construir é, ela mesma, um ato distributivo.</w:t>
+        <w:t>A economia do bem-estar atribui ao Estado uma função alocativa: prover, ou induzir a provisão de, bens que o mercado ofereceria em quantidade inferior à socialmente desejável (MUSGRAVE; MUSGRAVE, 1980, cap. 1). A creche é um desses bens. Seus benefícios extravasam a família, na forma de participação materna no trabalho e de desenvolvimento infantil convertido em capacidade produtiva futura, e as famílias de menor renda, que menos podem pagar por vagas privadas, são as que mais se beneficiam do acesso (ATTANASIO; CATTAN; MEGHIR, 2022). Por isso a construção de creches pertence à infraestrutura social, entendida como o conjunto de equipamentos físicos e serviços de longa duração, como escolas, creches, unidades de saúde e habitação social, que sustentam o bem-estar e a capacidade produtiva de uma população (FRANSEN; DEL BUFALO; REVIGLIO, 2018, p. 14). Diferentemente de uma transferência monetária, o equipamento é fixo e indivisível: sua localização decide quem terá acesso ao serviço por décadas, e a decisão de onde construir é, ela mesma, um ato distributivo.</w:t>
       </w:r>
     </w:p>
     <w:p>
@@ -336,7 +336,7 @@
           <w:i w:val="0"/>
           <w:sz w:val="24"/>
         </w:rPr>
-        <w:t>A evidência sobre primeira infância sustenta a prioridade da creche pública. Attanasio, Cattan e Meghir (2022) sintetizam o modelo econômico de investimento parental e a literatura empírica: déficits de desenvolvimento acumulados nos primeiros anos são difíceis de reverter e transmitem pobreza entre gerações. No Brasil, o experimento de loteria de vagas em creches do Rio de Janeiro mostrou aumento do emprego e da renda dos cuidadores e ganhos de desenvolvimento para as crianças de famílias mais pobres (ATTANASIO et al., 2022). O Banco Mundial estima que cerca de 350 milhões de crianças abaixo da idade escolar precisam de cuidado e não têm acesso a ele, e propõe tratar a creche como infraestrutura de capital humano, com financiamento público e focalização nas famílias de menor renda (DEVERCELLI; BEATON-DAY, 2020, p. 1-3). A OCDE registra matrícula de 29% dos menores de três anos nos países-membros em 2023 e associa os resultados à governança integrada entre educação e assistência (OECD, 2021, 2024), e a meta 4.2 dos Objetivos de Desenvolvimento Sustentável fixa o acesso à educação na primeira infância como compromisso até 2030 (UNITED NATIONS, 2015). Na América Latina, a expansão chilena de salas cuna garantiu acesso às famílias dos 60% mais vulneráveis (CHILE, 2024) e o Plan CAIF uruguaio dirige a abertura de centros por diagnóstico territorial (URUGUAI, 2018): em ambos, o critério de localização é explícito.</w:t>
+        <w:t>A evidência sobre primeira infância sustenta a prioridade da creche pública. Attanasio, Cattan e Meghir (2022) mostram que déficits de desenvolvimento acumulados nos primeiros anos são difíceis de reverter e transmitem pobreza entre gerações. No Brasil, a loteria de vagas em creches do Rio de Janeiro elevou em 34% o tempo das crianças em creche nos quatro primeiros anos de vida, aumentou a renda domiciliar e produziu ganhos sustentados de estatura e peso para a idade (ATTANASIO et al., 2022, p. 2). O Banco Mundial propõe tratar a creche como infraestrutura de capital humano, com financiamento público e focalização nas famílias de menor renda (DEVERCELLI; BEATON-DAY, 2020, p. 1-3); a OCDE associa os resultados à governança integrada entre educação e assistência (OECD, 2021, 2024); e a meta 4.2 dos Objetivos de Desenvolvimento Sustentável fixa o acesso à educação na primeira infância como compromisso até 2030 (UNITED NATIONS, 2015). Na América Latina, o Chile garantiu salas cuna às famílias dos 60% mais vulneráveis (CHILE, 2024) e o Uruguai dirige a abertura de centros por diagnóstico territorial (URUGUAI, 2018): em ambos, o critério de localização é explícito.</w:t>
       </w:r>
     </w:p>
     <w:p>
@@ -419,7 +419,7 @@
           <w:i w:val="0"/>
           <w:sz w:val="24"/>
         </w:rPr>
-        <w:t>O programa foi instituído pela Lei Estadual nº 21.870, de 19 de dezembro de 2023, com três objetivos: construir creches para crianças de zero a três anos em situação de vulnerabilidade; celebrar termos de cooperação com os municípios que cumpram critérios definidos por ato do Executivo; e operacionalizar a transferência fundo a fundo (PARANÁ, 2023a). O planejamento plurianual deu ao programa sua expressão orçamentária. O Plano Plurianual 2024-2027 (Lei Estadual nº 21.861/2023) organiza a ação do Estado em programas, ações orçamentárias e entregas, cada uma com unidade de medida, quantitativo anual e, quando cabível, regionalização, e é revisado anualmente em conjunto com a Lei de Diretrizes Orçamentárias, cujos anexos atualizam metas e entregas e servem de base ao monitoramento semestral encaminhado à Assembleia Legislativa (PARANÁ, 2023b, 2025c). A construção de creches consta como entrega 4670 da ação 7010 (Projetos Estratégicos Integrados) do programa Paraná que Cuida, a cargo da Secretaria de Estado do Desenvolvimento Social e Família (SEDEF), descrita como repasse para "instalação de creches sustentáveis" com meta de 72 municípios beneficiados por ano entre 2024 e 2026 (PARANÁ, 2023b). A revisão anual do plano, veiculada pela Lei de Diretrizes Orçamentárias, altera indicadores e entregas e transfere entregas entre ações orçamentárias, com justificativas baseadas na execução; no ajustamento encaminhado com o projeto da LDO para 2026, a entrega de creches não foi alterada, enquanto a entrega correlata de apoio a famílias na primeira infância teve descrição, fonte de apuração e meta revisadas (PARANÁ, 2025c, p. 175-179). A meta física do plano, 72 municípios por ano, ficou aquém do alcance da lista publicada em 2024, com 261 municípios, diferença que o ajustamento não corrigiu e que mostra como a expressão orçamentária de uma política pode descolar-se de sua regra efetiva de alocação.</w:t>
+        <w:t>O programa foi instituído pela Lei Estadual nº 21.870, de 19 de dezembro de 2023, com três objetivos: construir creches para crianças de zero a três anos em situação de vulnerabilidade; celebrar termos de cooperação com os municípios que cumpram critérios definidos por ato do Executivo; e operacionalizar a transferência fundo a fundo (PARANÁ, 2023a). O Plano Plurianual 2024-2027 (Lei Estadual nº 21.861/2023) organiza a ação do Estado em programas, ações orçamentárias e entregas, com unidade de medida, quantitativo anual e regionalização, e é revisado anualmente pela Lei de Diretrizes Orçamentárias, cujo anexo de ajustamento altera indicadores e entregas com justificativas baseadas na execução e serve de base ao monitoramento encaminhado à Assembleia Legislativa (PARANÁ, 2023b, 2025c). A construção de creches consta como entrega 4670 da ação 7010 do programa Paraná que Cuida, a cargo da Secretaria de Estado do Desenvolvimento Social e Família (SEDEF), com meta de 72 municípios beneficiados por ano entre 2024 e 2026 (PARANÁ, 2023b); no ajustamento encaminhado com a LDO para 2026 essa entrega não foi alterada (PARANÁ, 2025c, p. 175-179), e a meta ficou aquém dos 261 municípios da lista publicada em 2024, o que mostra como a expressão orçamentária de uma política pode descolar-se de sua regra efetiva de alocação.</w:t>
       </w:r>
     </w:p>
     <w:p>
@@ -2248,7 +2248,7 @@
           <w:i w:val="0"/>
           <w:sz w:val="24"/>
         </w:rPr>
-        <w:t>A adesão se formaliza por termo assinado pelo prefeito e pelo fundo municipal, após aprovação do conselho municipal de direitos, com terreno próprio de 1.200 m². O repasse ocorre em cinco parcelas: 10% na habilitação, 20% na aprovação do projeto de implantação e três parcelas iguais após vistoria de 40%, 70% e 100% da obra. O teto por unidade foi de R$ 1.304.792,16 em 2024 e de R$ 1.994.362,02 a partir de 2025 (PARANÁ, 2024c, art. 3º e 11; 2025a). A dimensão fiscal municipal aparece em três obrigações: o custo que exceder o teto é do município; a obra deve ser concluída em 36 meses, sob pena de restituição; e o custeio posterior é municipal, financiado pelo Fundeb e por receitas próprias (PARANÁ, 2024c, art. 12, 13 e 18). Os recursos vieram do Tesouro estadual, em complementação ao FIA, e da devolução de duodécimo pela Assembleia Legislativa, de R$ 100 milhões em 2024. O desenho transfere capital com condicionalidade de execução e deixa ao município a operação, e responde às lições do Proinfância com projeto padrão, orçamento de referência, ente técnico estadual e liberação por marco físico. O Quadro 1 situa esse desenho entre programas comparáveis.</w:t>
+        <w:t>A adesão se formaliza por termo assinado pelo prefeito e pelo fundo municipal, após aprovação do conselho municipal de direitos, com terreno próprio de 1.200 m²; o repasse ocorre em cinco parcelas, 10% na habilitação, 20% na aprovação do projeto e três iguais após vistoria de 40%, 70% e 100% da obra, com teto de R$ 1.304.792,16 por unidade em 2024 e R$ 1.994.362,02 a partir de 2025 (PARANÁ, 2024c, art. 3º e 11; 2025a). A dimensão fiscal municipal aparece em três obrigações: o custo que exceder o teto é do município; a obra deve ser concluída em 36 meses, sob pena de restituição; e o custeio posterior é municipal, financiado pelo Fundeb e por receitas próprias (PARANÁ, 2024c, art. 12, 13 e 18). Os recursos vieram do Tesouro estadual, em complementação ao FIA, e da devolução de duodécimo pela Assembleia Legislativa. O desenho transfere capital com condicionalidade de execução, deixa ao município a operação e responde às lições do Proinfância com projeto padrão, ente técnico estadual e liberação por marco físico (Quadro 1).</w:t>
       </w:r>
     </w:p>
     <w:p>
@@ -2277,10 +2277,9 @@
         <w:tblW w:w="9070" w:type="dxa"/>
       </w:tblPr>
       <w:tblGrid>
-        <w:gridCol w:w="1701"/>
-        <w:gridCol w:w="1474"/>
-        <w:gridCol w:w="2268"/>
-        <w:gridCol w:w="3628"/>
+        <w:gridCol w:w="3024"/>
+        <w:gridCol w:w="3024"/>
+        <w:gridCol w:w="3024"/>
       </w:tblGrid>
       <w:tr>
         <w:trPr>
@@ -2289,7 +2288,7 @@
         </w:trPr>
         <w:tc>
           <w:tcPr>
-            <w:tcW w:type="dxa" w:w="2268"/>
+            <w:tcW w:type="dxa" w:w="3024"/>
             <w:tcMar>
               <w:left w:w="40" w:type="dxa"/>
               <w:right w:w="40" w:type="dxa"/>
@@ -2322,7 +2321,7 @@
         </w:tc>
         <w:tc>
           <w:tcPr>
-            <w:tcW w:type="dxa" w:w="2268"/>
+            <w:tcW w:type="dxa" w:w="3024"/>
             <w:tcMar>
               <w:left w:w="40" w:type="dxa"/>
               <w:right w:w="40" w:type="dxa"/>
@@ -2355,7 +2354,7 @@
         </w:tc>
         <w:tc>
           <w:tcPr>
-            <w:tcW w:type="dxa" w:w="2268"/>
+            <w:tcW w:type="dxa" w:w="3024"/>
             <w:tcMar>
               <w:left w:w="40" w:type="dxa"/>
               <w:right w:w="40" w:type="dxa"/>
@@ -2386,17 +2385,22 @@
             </w:r>
           </w:p>
         </w:tc>
-        <w:tc>
-          <w:tcPr>
-            <w:tcW w:type="dxa" w:w="2268"/>
+      </w:tr>
+      <w:tr>
+        <w:trPr>
+          <w:cantSplit/>
+        </w:trPr>
+        <w:tc>
+          <w:tcPr>
+            <w:tcW w:type="dxa" w:w="3024"/>
             <w:tcMar>
               <w:left w:w="40" w:type="dxa"/>
               <w:right w:w="40" w:type="dxa"/>
             </w:tcMar>
             <w:vAlign w:val="center"/>
             <w:tcBorders>
-              <w:top w:val="single" w:sz="8" w:color="3A3A3A"/>
-              <w:bottom w:val="single" w:sz="4" w:color="3A3A3A"/>
+              <w:top w:val="nil"/>
+              <w:bottom w:val="single" w:sz="2" w:color="3A3A3A"/>
               <w:left w:val="nil"/>
               <w:right w:val="nil"/>
             </w:tcBorders>
@@ -2412,21 +2416,16 @@
             <w:r>
               <w:rPr>
                 <w:rFonts w:ascii="Arial" w:hAnsi="Arial"/>
-                <w:b/>
-                <w:sz w:val="16"/>
-              </w:rPr>
-              <w:t>Escala e resultados documentados</w:t>
+                <w:b w:val="0"/>
+                <w:sz w:val="17"/>
+              </w:rPr>
+              <w:t>Novo PAC, creches e pré-escolas (União, 2023 e 2025)</w:t>
             </w:r>
           </w:p>
         </w:tc>
-      </w:tr>
-      <w:tr>
-        <w:trPr>
-          <w:cantSplit/>
-        </w:trPr>
-        <w:tc>
-          <w:tcPr>
-            <w:tcW w:type="dxa" w:w="1701"/>
+        <w:tc>
+          <w:tcPr>
+            <w:tcW w:type="dxa" w:w="3024"/>
             <w:tcMar>
               <w:left w:w="40" w:type="dxa"/>
               <w:right w:w="40" w:type="dxa"/>
@@ -2453,13 +2452,13 @@
                 <w:b w:val="0"/>
                 <w:sz w:val="17"/>
               </w:rPr>
-              <w:t>Proinfância (União, FNDE, desde 2007)</w:t>
+              <w:t>Seleção pública; transferência ao município; projeto padrão; execução municipal</w:t>
             </w:r>
           </w:p>
         </w:tc>
         <w:tc>
           <w:tcPr>
-            <w:tcW w:type="dxa" w:w="1474"/>
+            <w:tcW w:type="dxa" w:w="3024"/>
             <w:tcMar>
               <w:left w:w="40" w:type="dxa"/>
               <w:right w:w="40" w:type="dxa"/>
@@ -2486,13 +2485,18 @@
                 <w:b w:val="0"/>
                 <w:sz w:val="17"/>
               </w:rPr>
-              <w:t>Assistência financeira ao município no âmbito do PAR; projeto padrão do FNDE; município licita e executa</w:t>
+              <w:t>Déficit em relação à Meta 1 do PNE, indicador sintético do FNDE, nível socioeconômico (Inse), capacidade financeira (VAAT) e terreno</w:t>
             </w:r>
           </w:p>
         </w:tc>
-        <w:tc>
-          <w:tcPr>
-            <w:tcW w:type="dxa" w:w="2268"/>
+      </w:tr>
+      <w:tr>
+        <w:trPr>
+          <w:cantSplit/>
+        </w:trPr>
+        <w:tc>
+          <w:tcPr>
+            <w:tcW w:type="dxa" w:w="3024"/>
             <w:tcMar>
               <w:left w:w="40" w:type="dxa"/>
               <w:right w:w="40" w:type="dxa"/>
@@ -2519,13 +2523,13 @@
                 <w:b w:val="0"/>
                 <w:sz w:val="17"/>
               </w:rPr>
-              <w:t>Adesão por demanda municipal, sem ordenação explícita por necessidade</w:t>
+              <w:t>Creche Escola (São Paulo, Decreto 57.367/2011)</w:t>
             </w:r>
           </w:p>
         </w:tc>
         <w:tc>
           <w:tcPr>
-            <w:tcW w:type="dxa" w:w="3628"/>
+            <w:tcW w:type="dxa" w:w="3024"/>
             <w:tcMar>
               <w:left w:w="40" w:type="dxa"/>
               <w:right w:w="40" w:type="dxa"/>
@@ -2552,18 +2556,13 @@
                 <w:b w:val="0"/>
                 <w:sz w:val="17"/>
               </w:rPr>
-              <w:t>8.824 obras pactuadas até 2017, 3.482 concluídas e 1.478 em funcionamento</w:t>
+              <w:t>Estado financia obra e mobiliário por meio da FDE, com projeto padrão; município cede terreno, licita, executa e mantém</w:t>
             </w:r>
           </w:p>
         </w:tc>
-      </w:tr>
-      <w:tr>
-        <w:trPr>
-          <w:cantSplit/>
-        </w:trPr>
-        <w:tc>
-          <w:tcPr>
-            <w:tcW w:type="dxa" w:w="1701"/>
+        <w:tc>
+          <w:tcPr>
+            <w:tcW w:type="dxa" w:w="3024"/>
             <w:tcMar>
               <w:left w:w="40" w:type="dxa"/>
               <w:right w:w="40" w:type="dxa"/>
@@ -2590,13 +2589,18 @@
                 <w:b w:val="0"/>
                 <w:sz w:val="17"/>
               </w:rPr>
-              <w:t>Novo PAC, creches e pré-escolas (União, 2023 e 2025)</w:t>
+              <w:t>Vulnerabilidade social e déficit de vagas apurados pela Secretaria de Desenvolvimento Social e pela Seade</w:t>
             </w:r>
           </w:p>
         </w:tc>
-        <w:tc>
-          <w:tcPr>
-            <w:tcW w:type="dxa" w:w="1474"/>
+      </w:tr>
+      <w:tr>
+        <w:trPr>
+          <w:cantSplit/>
+        </w:trPr>
+        <w:tc>
+          <w:tcPr>
+            <w:tcW w:type="dxa" w:w="3024"/>
             <w:tcMar>
               <w:left w:w="40" w:type="dxa"/>
               <w:right w:w="40" w:type="dxa"/>
@@ -2623,13 +2627,13 @@
                 <w:b w:val="0"/>
                 <w:sz w:val="17"/>
               </w:rPr>
-              <w:t>Seleção pública; transferência ao município; projeto padrão; execução municipal</w:t>
+              <w:t>Mais Infância Ceará (Ceará, desde 2015; Lei 17.380/2021)</w:t>
             </w:r>
           </w:p>
         </w:tc>
         <w:tc>
           <w:tcPr>
-            <w:tcW w:type="dxa" w:w="2268"/>
+            <w:tcW w:type="dxa" w:w="3024"/>
             <w:tcMar>
               <w:left w:w="40" w:type="dxa"/>
               <w:right w:w="40" w:type="dxa"/>
@@ -2656,13 +2660,13 @@
                 <w:b w:val="0"/>
                 <w:sz w:val="17"/>
               </w:rPr>
-              <w:t>Déficit em relação à Meta 1 do PNE, indicador sintético do FNDE, nível socioeconômico (Inse), capacidade financeira (VAAT) e terreno</w:t>
+              <w:t>Estado constrói os Centros de Educação Infantil e os entrega aos municípios; política intersetorial permanente</w:t>
             </w:r>
           </w:p>
         </w:tc>
         <w:tc>
           <w:tcPr>
-            <w:tcW w:type="dxa" w:w="3628"/>
+            <w:tcW w:type="dxa" w:w="3024"/>
             <w:tcMar>
               <w:left w:w="40" w:type="dxa"/>
               <w:right w:w="40" w:type="dxa"/>
@@ -2689,7 +2693,7 @@
                 <w:b w:val="0"/>
                 <w:sz w:val="17"/>
               </w:rPr>
-              <w:t>1.000 unidades e R$ 3,25 bilhões em 2023; 500 unidades e R$ 2,3 bilhões em 2025</w:t>
+              <w:t>Prioridade a municípios em extrema vulnerabilidade, por IDH e renda per capita (art. 21)</w:t>
             </w:r>
           </w:p>
         </w:tc>
@@ -2700,7 +2704,7 @@
         </w:trPr>
         <w:tc>
           <w:tcPr>
-            <w:tcW w:type="dxa" w:w="1701"/>
+            <w:tcW w:type="dxa" w:w="3024"/>
             <w:tcMar>
               <w:left w:w="40" w:type="dxa"/>
               <w:right w:w="40" w:type="dxa"/>
@@ -2708,7 +2712,7 @@
             <w:vAlign w:val="center"/>
             <w:tcBorders>
               <w:top w:val="nil"/>
-              <w:bottom w:val="single" w:sz="2" w:color="3A3A3A"/>
+              <w:bottom w:val="single" w:sz="8" w:color="3A3A3A"/>
               <w:left w:val="nil"/>
               <w:right w:val="nil"/>
             </w:tcBorders>
@@ -2727,13 +2731,13 @@
                 <w:b w:val="0"/>
                 <w:sz w:val="17"/>
               </w:rPr>
-              <w:t>Creche Escola (São Paulo, Decreto 57.367/2011)</w:t>
+              <w:t>Infância Feliz Paraná (Paraná, desde 2023)</w:t>
             </w:r>
           </w:p>
         </w:tc>
         <w:tc>
           <w:tcPr>
-            <w:tcW w:type="dxa" w:w="1474"/>
+            <w:tcW w:type="dxa" w:w="3024"/>
             <w:tcMar>
               <w:left w:w="40" w:type="dxa"/>
               <w:right w:w="40" w:type="dxa"/>
@@ -2741,7 +2745,7 @@
             <w:vAlign w:val="center"/>
             <w:tcBorders>
               <w:top w:val="nil"/>
-              <w:bottom w:val="single" w:sz="2" w:color="3A3A3A"/>
+              <w:bottom w:val="single" w:sz="8" w:color="3A3A3A"/>
               <w:left w:val="nil"/>
               <w:right w:val="nil"/>
             </w:tcBorders>
@@ -2760,13 +2764,13 @@
                 <w:b w:val="0"/>
                 <w:sz w:val="17"/>
               </w:rPr>
-              <w:t>Estado financia obra e mobiliário por meio da FDE, com projeto padrão; município cede terreno, licita, executa e mantém</w:t>
+              <w:t>Incentivo fundo a fundo (FIA/PR aos fundos municipais) por termo de adesão, em cinco parcelas; projeto padrão; execução municipal</w:t>
             </w:r>
           </w:p>
         </w:tc>
         <w:tc>
           <w:tcPr>
-            <w:tcW w:type="dxa" w:w="2268"/>
+            <w:tcW w:type="dxa" w:w="3024"/>
             <w:tcMar>
               <w:left w:w="40" w:type="dxa"/>
               <w:right w:w="40" w:type="dxa"/>
@@ -2774,7 +2778,7 @@
             <w:vAlign w:val="center"/>
             <w:tcBorders>
               <w:top w:val="nil"/>
-              <w:bottom w:val="single" w:sz="2" w:color="3A3A3A"/>
+              <w:bottom w:val="single" w:sz="8" w:color="3A3A3A"/>
               <w:left w:val="nil"/>
               <w:right w:val="nil"/>
             </w:tcBorders>
@@ -2793,314 +2797,7 @@
                 <w:b w:val="0"/>
                 <w:sz w:val="17"/>
               </w:rPr>
-              <w:t>Vulnerabilidade social e déficit de vagas apurados pela Secretaria de Desenvolvimento Social e pela Seade</w:t>
-            </w:r>
-          </w:p>
-        </w:tc>
-        <w:tc>
-          <w:tcPr>
-            <w:tcW w:type="dxa" w:w="3628"/>
-            <w:tcMar>
-              <w:left w:w="40" w:type="dxa"/>
-              <w:right w:w="40" w:type="dxa"/>
-            </w:tcMar>
-            <w:vAlign w:val="center"/>
-            <w:tcBorders>
-              <w:top w:val="nil"/>
-              <w:bottom w:val="single" w:sz="2" w:color="3A3A3A"/>
-              <w:left w:val="nil"/>
-              <w:right w:val="nil"/>
-            </w:tcBorders>
-          </w:tcPr>
-          <w:p>
-            <w:pPr>
-              <w:pStyle w:val="Tabela"/>
-              <w:keepNext/>
-              <w:ind w:firstLine="0" w:left="0"/>
-              <w:jc w:val="left"/>
-            </w:pPr>
-            <w:r/>
-            <w:r>
-              <w:rPr>
-                <w:rFonts w:ascii="Arial" w:hAnsi="Arial"/>
-                <w:b w:val="0"/>
-                <w:sz w:val="17"/>
-              </w:rPr>
-              <w:t>92 unidades e 12,3 mil vagas entre 2023 e 2026</w:t>
-            </w:r>
-          </w:p>
-        </w:tc>
-      </w:tr>
-      <w:tr>
-        <w:trPr>
-          <w:cantSplit/>
-        </w:trPr>
-        <w:tc>
-          <w:tcPr>
-            <w:tcW w:type="dxa" w:w="1701"/>
-            <w:tcMar>
-              <w:left w:w="40" w:type="dxa"/>
-              <w:right w:w="40" w:type="dxa"/>
-            </w:tcMar>
-            <w:vAlign w:val="center"/>
-            <w:tcBorders>
-              <w:top w:val="nil"/>
-              <w:bottom w:val="single" w:sz="2" w:color="3A3A3A"/>
-              <w:left w:val="nil"/>
-              <w:right w:val="nil"/>
-            </w:tcBorders>
-          </w:tcPr>
-          <w:p>
-            <w:pPr>
-              <w:pStyle w:val="Tabela"/>
-              <w:keepNext/>
-              <w:ind w:firstLine="0" w:left="0"/>
-              <w:jc w:val="left"/>
-            </w:pPr>
-            <w:r/>
-            <w:r>
-              <w:rPr>
-                <w:rFonts w:ascii="Arial" w:hAnsi="Arial"/>
-                <w:b w:val="0"/>
-                <w:sz w:val="17"/>
-              </w:rPr>
-              <w:t>Mais Infância Ceará (Ceará, desde 2015; Lei 17.380/2021)</w:t>
-            </w:r>
-          </w:p>
-        </w:tc>
-        <w:tc>
-          <w:tcPr>
-            <w:tcW w:type="dxa" w:w="1474"/>
-            <w:tcMar>
-              <w:left w:w="40" w:type="dxa"/>
-              <w:right w:w="40" w:type="dxa"/>
-            </w:tcMar>
-            <w:vAlign w:val="center"/>
-            <w:tcBorders>
-              <w:top w:val="nil"/>
-              <w:bottom w:val="single" w:sz="2" w:color="3A3A3A"/>
-              <w:left w:val="nil"/>
-              <w:right w:val="nil"/>
-            </w:tcBorders>
-          </w:tcPr>
-          <w:p>
-            <w:pPr>
-              <w:pStyle w:val="Tabela"/>
-              <w:keepNext/>
-              <w:ind w:firstLine="0" w:left="0"/>
-              <w:jc w:val="left"/>
-            </w:pPr>
-            <w:r/>
-            <w:r>
-              <w:rPr>
-                <w:rFonts w:ascii="Arial" w:hAnsi="Arial"/>
-                <w:b w:val="0"/>
-                <w:sz w:val="17"/>
-              </w:rPr>
-              <w:t>Estado constrói os Centros de Educação Infantil e os entrega aos municípios; política intersetorial permanente</w:t>
-            </w:r>
-          </w:p>
-        </w:tc>
-        <w:tc>
-          <w:tcPr>
-            <w:tcW w:type="dxa" w:w="2268"/>
-            <w:tcMar>
-              <w:left w:w="40" w:type="dxa"/>
-              <w:right w:w="40" w:type="dxa"/>
-            </w:tcMar>
-            <w:vAlign w:val="center"/>
-            <w:tcBorders>
-              <w:top w:val="nil"/>
-              <w:bottom w:val="single" w:sz="2" w:color="3A3A3A"/>
-              <w:left w:val="nil"/>
-              <w:right w:val="nil"/>
-            </w:tcBorders>
-          </w:tcPr>
-          <w:p>
-            <w:pPr>
-              <w:pStyle w:val="Tabela"/>
-              <w:keepNext/>
-              <w:ind w:firstLine="0" w:left="0"/>
-              <w:jc w:val="left"/>
-            </w:pPr>
-            <w:r/>
-            <w:r>
-              <w:rPr>
-                <w:rFonts w:ascii="Arial" w:hAnsi="Arial"/>
-                <w:b w:val="0"/>
-                <w:sz w:val="17"/>
-              </w:rPr>
-              <w:t>Prioridade a municípios em extrema vulnerabilidade, por IDH e renda per capita (art. 21)</w:t>
-            </w:r>
-          </w:p>
-        </w:tc>
-        <w:tc>
-          <w:tcPr>
-            <w:tcW w:type="dxa" w:w="3628"/>
-            <w:tcMar>
-              <w:left w:w="40" w:type="dxa"/>
-              <w:right w:w="40" w:type="dxa"/>
-            </w:tcMar>
-            <w:vAlign w:val="center"/>
-            <w:tcBorders>
-              <w:top w:val="nil"/>
-              <w:bottom w:val="single" w:sz="2" w:color="3A3A3A"/>
-              <w:left w:val="nil"/>
-              <w:right w:val="nil"/>
-            </w:tcBorders>
-          </w:tcPr>
-          <w:p>
-            <w:pPr>
-              <w:pStyle w:val="Tabela"/>
-              <w:keepNext/>
-              <w:ind w:firstLine="0" w:left="0"/>
-              <w:jc w:val="left"/>
-            </w:pPr>
-            <w:r/>
-            <w:r>
-              <w:rPr>
-                <w:rFonts w:ascii="Arial" w:hAnsi="Arial"/>
-                <w:b w:val="0"/>
-                <w:sz w:val="17"/>
-              </w:rPr>
-              <w:t>56 unidades em construção em 2019; 42 autorizadas em 2023</w:t>
-            </w:r>
-          </w:p>
-        </w:tc>
-      </w:tr>
-      <w:tr>
-        <w:trPr>
-          <w:cantSplit/>
-        </w:trPr>
-        <w:tc>
-          <w:tcPr>
-            <w:tcW w:type="dxa" w:w="1701"/>
-            <w:tcMar>
-              <w:left w:w="40" w:type="dxa"/>
-              <w:right w:w="40" w:type="dxa"/>
-            </w:tcMar>
-            <w:vAlign w:val="center"/>
-            <w:tcBorders>
-              <w:top w:val="nil"/>
-              <w:bottom w:val="single" w:sz="8" w:color="3A3A3A"/>
-              <w:left w:val="nil"/>
-              <w:right w:val="nil"/>
-            </w:tcBorders>
-          </w:tcPr>
-          <w:p>
-            <w:pPr>
-              <w:pStyle w:val="Tabela"/>
-              <w:keepNext/>
-              <w:ind w:firstLine="0" w:left="0"/>
-              <w:jc w:val="left"/>
-            </w:pPr>
-            <w:r/>
-            <w:r>
-              <w:rPr>
-                <w:rFonts w:ascii="Arial" w:hAnsi="Arial"/>
-                <w:b w:val="0"/>
-                <w:sz w:val="17"/>
-              </w:rPr>
-              <w:t>Infância Feliz Paraná (Paraná, desde 2023)</w:t>
-            </w:r>
-          </w:p>
-        </w:tc>
-        <w:tc>
-          <w:tcPr>
-            <w:tcW w:type="dxa" w:w="1474"/>
-            <w:tcMar>
-              <w:left w:w="40" w:type="dxa"/>
-              <w:right w:w="40" w:type="dxa"/>
-            </w:tcMar>
-            <w:vAlign w:val="center"/>
-            <w:tcBorders>
-              <w:top w:val="nil"/>
-              <w:bottom w:val="single" w:sz="8" w:color="3A3A3A"/>
-              <w:left w:val="nil"/>
-              <w:right w:val="nil"/>
-            </w:tcBorders>
-          </w:tcPr>
-          <w:p>
-            <w:pPr>
-              <w:pStyle w:val="Tabela"/>
-              <w:keepNext/>
-              <w:ind w:firstLine="0" w:left="0"/>
-              <w:jc w:val="left"/>
-            </w:pPr>
-            <w:r/>
-            <w:r>
-              <w:rPr>
-                <w:rFonts w:ascii="Arial" w:hAnsi="Arial"/>
-                <w:b w:val="0"/>
-                <w:sz w:val="17"/>
-              </w:rPr>
-              <w:t>Incentivo fundo a fundo (FIA/PR aos fundos municipais) por termo de adesão, em cinco parcelas; projeto padrão; execução municipal</w:t>
-            </w:r>
-          </w:p>
-        </w:tc>
-        <w:tc>
-          <w:tcPr>
-            <w:tcW w:type="dxa" w:w="2268"/>
-            <w:tcMar>
-              <w:left w:w="40" w:type="dxa"/>
-              <w:right w:w="40" w:type="dxa"/>
-            </w:tcMar>
-            <w:vAlign w:val="center"/>
-            <w:tcBorders>
-              <w:top w:val="nil"/>
-              <w:bottom w:val="single" w:sz="8" w:color="3A3A3A"/>
-              <w:left w:val="nil"/>
-              <w:right w:val="nil"/>
-            </w:tcBorders>
-          </w:tcPr>
-          <w:p>
-            <w:pPr>
-              <w:pStyle w:val="Tabela"/>
-              <w:keepNext/>
-              <w:ind w:firstLine="0" w:left="0"/>
-              <w:jc w:val="left"/>
-            </w:pPr>
-            <w:r/>
-            <w:r>
-              <w:rPr>
-                <w:rFonts w:ascii="Arial" w:hAnsi="Arial"/>
-                <w:b w:val="0"/>
-                <w:sz w:val="17"/>
-              </w:rPr>
               <w:t>Indicador composto (PCM) com três pilares e faixas de porte; etapa prévia com índice do Ipardes; lista pública com substituição do desistente</w:t>
-            </w:r>
-          </w:p>
-        </w:tc>
-        <w:tc>
-          <w:tcPr>
-            <w:tcW w:type="dxa" w:w="3628"/>
-            <w:tcMar>
-              <w:left w:w="40" w:type="dxa"/>
-              <w:right w:w="40" w:type="dxa"/>
-            </w:tcMar>
-            <w:vAlign w:val="center"/>
-            <w:tcBorders>
-              <w:top w:val="nil"/>
-              <w:bottom w:val="single" w:sz="8" w:color="3A3A3A"/>
-              <w:left w:val="nil"/>
-              <w:right w:val="nil"/>
-            </w:tcBorders>
-          </w:tcPr>
-          <w:p>
-            <w:pPr>
-              <w:pStyle w:val="Tabela"/>
-              <w:keepNext/>
-              <w:ind w:firstLine="0" w:left="0"/>
-              <w:jc w:val="left"/>
-            </w:pPr>
-            <w:r/>
-            <w:r>
-              <w:rPr>
-                <w:rFonts w:ascii="Arial" w:hAnsi="Arial"/>
-                <w:b w:val="0"/>
-                <w:sz w:val="17"/>
-              </w:rPr>
-              <w:t>303 unidades em 261 municípios (2024); segunda etapa em 2025; 110 obras em maio de 2026</w:t>
             </w:r>
           </w:p>
         </w:tc>
@@ -4235,7 +3932,7 @@
           <w:i w:val="0"/>
           <w:sz w:val="24"/>
         </w:rPr>
-        <w:t>A análise apoia-se em três procedimentos. A reconstrução documental usa a lei, as deliberações do CEDCA, as resoluções da SEDEF, o Plano Plurianual e sua base de entregas e a apresentação institucional do programa para datar decisões e parâmetros. A auditoria das planilhas de cálculo, em três versões (março, maio e junho de 2024), reproduziu célula a célula as fórmulas dos pilares, do índice e das regras de distribuição, com junção dos 399 municípios pelo código do IBGE. A análise de sensibilidade recalculou o ordenamento sob pesos e normalizações alternativos e comparou a distribuição adotada com critérios contrafactuais que distribuem o mesmo número de unidades. Os três procedimentos configuram uma avaliação ex ante da regra: examinam o que a regra faz com a seleção territorial antes de qualquer obra. Base tratada, scripts, mapas e diagramas editáveis acompanham o artigo como material suplementar.</w:t>
+        <w:t>A análise apoia-se em três procedimentos, que configuram uma avaliação ex ante da regra. A reconstrução documental usa a lei, as deliberações do CEDCA, as resoluções da SEDEF, o Plano Plurianual e a apresentação institucional do programa para datar decisões e parâmetros. A auditoria das planilhas de cálculo, em três versões (março, maio e junho de 2024), reproduziu célula a célula as fórmulas dos pilares, do índice e das regras de distribuição, com junção dos 399 municípios pelo código do IBGE. A análise de sensibilidade recalculou o ordenamento sob pesos e normalizações alternativos e comparou a distribuição adotada com critérios contrafactuais que distribuem o mesmo número de unidades.</w:t>
       </w:r>
       <w:r>
         <w:rPr>
@@ -4692,7 +4389,7 @@
           <w:i w:val="0"/>
           <w:sz w:val="24"/>
         </w:rPr>
-        <w:t>No Paraná, as 185 mil matrículas em creche de 2023 correspondiam a 26,5% das 698 mil crianças de zero a quatro anos, e 42% dos estabelecimentos com creche eram privados. Em termos nacionais, a taxa de atendimento de crianças de zero a três anos era de [[FE_PR]] no estado em 2024, contra [[FE_BR]] no Brasil, o que situa o Paraná na [[FE_POS]] posição entre as unidades da federação (TODOS PELA EDUCAÇÃO, 2025). O fator varia de zero (Ivatuba) a cem (Almirante Tamandaré), com mediana de 54,8, e cresce com o tamanho do município, porque a cobertura relativa é menor nas cidades grandes (Mapa 1).</w:t>
+        <w:t>No Paraná, as 185 mil matrículas em creche de 2023 correspondiam a 26,5% das 698 mil crianças de zero a quatro anos, e 42% dos estabelecimentos com creche eram privados. Em termos nacionais, 42,0% das crianças paranaenses de zero a três anos frequentavam creche em 2024, contra 41,2% no Brasil, o que situa o estado na quarta posição entre as 27 unidades da federação, atrás de São Paulo, Santa Catarina e Rio Grande do Sul (TODOS PELA EDUCAÇÃO, 2025b). O fator varia de zero (Ivatuba) a cem (Almirante Tamandaré), com mediana de 54,8, e cresce com o tamanho do município, porque a cobertura relativa é menor nas cidades grandes (Mapa 1).</w:t>
       </w:r>
     </w:p>
     <w:p>
@@ -4722,7 +4419,7 @@
       <w:r>
         <w:drawing>
           <wp:inline xmlns:a="http://schemas.openxmlformats.org/drawingml/2006/main" xmlns:pic="http://schemas.openxmlformats.org/drawingml/2006/picture">
-            <wp:extent cx="3960000" cy="3481062"/>
+            <wp:extent cx="3240000" cy="2848142"/>
             <wp:docPr id="1" name="Picture 1"/>
             <wp:cNvGraphicFramePr>
               <a:graphicFrameLocks noChangeAspect="1"/>
@@ -4743,7 +4440,7 @@
                   <pic:spPr>
                     <a:xfrm>
                       <a:off x="0" y="0"/>
-                      <a:ext cx="3960000" cy="3481062"/>
+                      <a:ext cx="3240000" cy="2848142"/>
                     </a:xfrm>
                     <a:prstGeom prst="rect"/>
                   </pic:spPr>
@@ -4818,7 +4515,7 @@
           <w:i w:val="0"/>
           <w:sz w:val="24"/>
         </w:rPr>
-        <w:t>O pilar demográfico mede a pressão da demanda com três indicadores: a mortalidade infantil, óbitos de menores de um ano por mil nascidos vivos, do Sistema de Informações sobre Mortalidade e do Sistema de Informações sobre Nascidos Vivos (DATASUS, 2022); a proporção de crianças pequenas na população total, do Censo de 2022; e a taxa bruta de natalidade, da base de dados do Ipardes (IPARDES, 2024). Os três entram em sentido direto, normalizados pela equação 1, e o fator é sua média simples reescalonada:</w:t>
+        <w:t>O pilar demográfico mede a pressão da demanda com três indicadores: a mortalidade infantil, óbitos de menores de um ano por mil nascidos vivos, do Sistema de Informações sobre Mortalidade e do Sistema de Informações sobre Nascidos Vivos (DATASUS, 2022); a proporção de crianças pequenas na população total, do Censo de 2022; e a taxa bruta de natalidade, da base de dados do Ipardes (IPARDES, 2024b). Os três entram em sentido direto, normalizados pela equação 1, e o fator é sua média simples reescalonada:</w:t>
       </w:r>
     </w:p>
     <w:p>
@@ -5007,7 +4704,7 @@
           <w:i w:val="0"/>
           <w:sz w:val="24"/>
         </w:rPr>
-        <w:t>A auditoria identificou que a coluna rotulada como população de zero a quatro anos na aba demográfica corresponde, pela magnitude, à população de zero a nove anos; a diferença altera a proporção usada, mas não o ordenamento relativo entre municípios, porque ambas as faixas estão fortemente correlacionadas (0,998). No Paraná, a mortalidade infantil era de [[FD_MI_PR]] por mil em [[FD_MI_ANO]], contra [[FD_MI_BR]] no Brasil ([[FD_MI_FONTE]]), e as crianças de zero a quatro anos eram 6,1% da população em 2022, contra [[FD_P04_BR]] no país (IBGE, 2023a). O fator varia de zero (Miraselva) a cem (Prado Ferreira), com mediana de 44,7, e não guarda relação com o porte (Mapa 2).</w:t>
+        <w:t>A auditoria identificou que a coluna rotulada como população de zero a quatro anos na aba demográfica corresponde, pela magnitude, à população de zero a nove anos; a diferença altera a proporção usada, mas não o ordenamento relativo entre municípios, porque ambas as faixas estão fortemente correlacionadas (0,998). No plano nacional, o Paraná tem pressão demográfica abaixo da média: a mortalidade infantil foi de 10,8 por mil nascidos vivos em 2023, a terceira menor do país, contra 12,6 no Brasil (DATASUS, 2025); a taxa bruta de natalidade foi de 12,2 por mil, contra 12,5; e as crianças de zero a quatro anos eram 6,1% da população em 2022, contra 6,3% no país (IBGE, 2023a). O índice opera, portanto, sobre a heterogeneidade dentro do estado. O fator varia de zero (Miraselva) a cem (Prado Ferreira), com mediana de 44,7, e não guarda relação com o porte (Mapa 2).</w:t>
       </w:r>
     </w:p>
     <w:p>
@@ -5037,7 +4734,7 @@
       <w:r>
         <w:drawing>
           <wp:inline xmlns:a="http://schemas.openxmlformats.org/drawingml/2006/main" xmlns:pic="http://schemas.openxmlformats.org/drawingml/2006/picture">
-            <wp:extent cx="3960000" cy="3481062"/>
+            <wp:extent cx="3240000" cy="2848142"/>
             <wp:docPr id="2" name="Picture 2"/>
             <wp:cNvGraphicFramePr>
               <a:graphicFrameLocks noChangeAspect="1"/>
@@ -5058,7 +4755,7 @@
                   <pic:spPr>
                     <a:xfrm>
                       <a:off x="0" y="0"/>
-                      <a:ext cx="3960000" cy="3481062"/>
+                      <a:ext cx="3240000" cy="2848142"/>
                     </a:xfrm>
                     <a:prstGeom prst="rect"/>
                   </pic:spPr>
@@ -5083,7 +4780,7 @@
           <w:i w:val="0"/>
           <w:sz w:val="20"/>
         </w:rPr>
-        <w:t>Fonte: Elaboração própria a partir de DATASUS (2022), IBGE (2023a, 2023b), IPARDES (2024) e das planilhas do estudo.</w:t>
+        <w:t>Fonte: Elaboração própria a partir de DATASUS (2022), IBGE (2023a, 2023b), IPARDES (2024b) e das planilhas do estudo.</w:t>
       </w:r>
     </w:p>
     <w:p>
@@ -5133,7 +4830,7 @@
           <w:i w:val="0"/>
           <w:sz w:val="24"/>
         </w:rPr>
-        <w:t>O pilar socioeconômico mede a vulnerabilidade com três indicadores: a proporção de crianças com peso baixo para a idade entre as acompanhadas pelo Sistema de Vigilância Alimentar e Nutricional (BRASIL, 2024); a proporção de crianças a serem acompanhadas pelas condicionalidades de saúde do Cadastro Único sobre a população de zero a nove anos (BRASIL, 2024); e a dimensão renda, emprego e produção agropecuária do Índice Ipardes de Desempenho Municipal (IPARDES, 2023), em sentido inverso. O fator é a média simples dos escores, reescalonada:</w:t>
+        <w:t>O pilar socioeconômico mede a vulnerabilidade com três indicadores: a proporção de crianças com peso baixo para a idade entre as acompanhadas pelo Sistema de Vigilância Alimentar e Nutricional (BRASIL, 2024); a proporção de crianças a serem acompanhadas pelas condicionalidades de saúde do Cadastro Único sobre a população de zero a nove anos (BRASIL, 2024); e a dimensão renda, emprego e produção agropecuária do Índice Ipardes de Desempenho Municipal (IPARDES, 2024a), em sentido inverso. O fator é a média simples dos escores, reescalonada:</w:t>
       </w:r>
     </w:p>
     <w:p>
@@ -5322,7 +5019,7 @@
           <w:i w:val="0"/>
           <w:sz w:val="24"/>
         </w:rPr>
-        <w:t>Na mediana dos municípios, 23,6% das crianças de zero a nove anos estavam entre as acompanhadas pelo Cadastro Único e 2,8% das crianças pesadas tinham peso baixo para a idade. No plano nacional, [[FS_CAD_PR]] das crianças paranaenses de zero a seis anos estavam inscritas no Cadastro Único em [[FS_CAD_ANO]], contra [[FS_CAD_BR]] no Brasil ([[FS_CAD_FONTE]]), e a renda domiciliar per capita do estado era a [[FS_RENDA_POS]] maior do país em [[FS_RENDA_ANO]] (IBGE, 2025). Curitiba tem fator zero, a referência mínima do estado; o máximo é Cruzmaltina; a mediana é 42,1. O fator cai com o tamanho do município e concentra os maiores valores no Centro-Sul, no Vale do Ribeira e no litoral norte (Mapa 3).</w:t>
+        <w:t>Na mediana dos municípios, 23,6% das crianças de zero a nove anos estavam entre as acompanhadas pelo Cadastro Único e 2,8% das crianças pesadas tinham peso baixo para a idade. No plano nacional, o Paraná tinha em 2024 a sexta maior renda domiciliar per capita do país, R$ 2.482 mensais contra R$ 2.069 no Brasil (IBGE, 2025b), e a quarta menor taxa de pobreza, 13,9% contra 23,4% (IJSN, 2025); a vulnerabilidade que o pilar mede é, assim, relativa ao estado. Curitiba tem fator zero, a referência mínima do estado; o máximo é Cruzmaltina; a mediana é 42,1. O fator cai com o tamanho do município e concentra os maiores valores no Centro-Sul, no Vale do Ribeira e no litoral norte (Mapa 3).</w:t>
       </w:r>
     </w:p>
     <w:p>
@@ -5352,7 +5049,7 @@
       <w:r>
         <w:drawing>
           <wp:inline xmlns:a="http://schemas.openxmlformats.org/drawingml/2006/main" xmlns:pic="http://schemas.openxmlformats.org/drawingml/2006/picture">
-            <wp:extent cx="3960000" cy="3481062"/>
+            <wp:extent cx="3240000" cy="2848142"/>
             <wp:docPr id="3" name="Picture 3"/>
             <wp:cNvGraphicFramePr>
               <a:graphicFrameLocks noChangeAspect="1"/>
@@ -5373,7 +5070,7 @@
                   <pic:spPr>
                     <a:xfrm>
                       <a:off x="0" y="0"/>
-                      <a:ext cx="3960000" cy="3481062"/>
+                      <a:ext cx="3240000" cy="2848142"/>
                     </a:xfrm>
                     <a:prstGeom prst="rect"/>
                   </pic:spPr>
@@ -5398,7 +5095,7 @@
           <w:i w:val="0"/>
           <w:sz w:val="20"/>
         </w:rPr>
-        <w:t>Fonte: Elaboração própria a partir de Brasil (2024), IPARDES (2023), IBGE (2023b) e das planilhas do estudo.</w:t>
+        <w:t>Fonte: Elaboração própria a partir de Brasil (2024), IPARDES (2024a), IBGE (2023b) e das planilhas do estudo.</w:t>
       </w:r>
     </w:p>
     <w:p>
@@ -6753,7 +6450,7 @@
       <w:r>
         <w:drawing>
           <wp:inline xmlns:a="http://schemas.openxmlformats.org/drawingml/2006/main" xmlns:pic="http://schemas.openxmlformats.org/drawingml/2006/picture">
-            <wp:extent cx="3960000" cy="3481062"/>
+            <wp:extent cx="3240000" cy="2848142"/>
             <wp:docPr id="4" name="Picture 4"/>
             <wp:cNvGraphicFramePr>
               <a:graphicFrameLocks noChangeAspect="1"/>
@@ -6774,7 +6471,7 @@
                   <pic:spPr>
                     <a:xfrm>
                       <a:off x="0" y="0"/>
-                      <a:ext cx="3960000" cy="3481062"/>
+                      <a:ext cx="3240000" cy="2848142"/>
                     </a:xfrm>
                     <a:prstGeom prst="rect"/>
                   </pic:spPr>
@@ -6833,7 +6530,7 @@
           <w:i w:val="0"/>
           <w:sz w:val="24"/>
         </w:rPr>
-        <w:t>Na normalização mínimo-máximo um único município define o zero ou o cem de cada indicador, o que torna o índice sensível a valores extremos (OECD; JRC, 2008, p. 28-30). Testamos três alterações: com pesos iguais entre os pilares, a correlação de postos com o PCM padrão é 0,97; com peso triplo no pilar socioeconômico, variante usada em uma versão intermediária das planilhas, 0,93; com normalização por percentis, 0,93, e 63 dos 80 municípios do quintil superior permanecem nele. O ordenamento é estável nos extremos e mais sensível na faixa intermediária, onde centésimos separam municípios.</w:t>
+        <w:t>Na normalização mínimo-máximo um único município define o zero ou o cem de cada indicador, o que torna o índice sensível a valores extremos (OECD; JRC, 2008, p. 27-30). Testamos três alterações: com pesos iguais entre os pilares, a correlação de postos com o PCM padrão é 0,97; com peso triplo no pilar socioeconômico, variante usada em uma versão intermediária das planilhas, 0,93; com normalização por percentis, 0,93, e 63 dos 80 municípios do quintil superior permanecem nele. O ordenamento é estável nos extremos e mais sensível na faixa intermediária, onde centésimos separam municípios.</w:t>
       </w:r>
     </w:p>
     <w:p>
@@ -17617,7 +17314,7 @@
           <w:i w:val="0"/>
           <w:sz w:val="24"/>
         </w:rPr>
-        <w:t>A Figura 6 resume o mecanismo que liga as evidências à alocação. Cada elo foi verificado: as fórmulas e fontes dos dados foram reproduzidas; o índice é estável a variações de pesos e normalização; as regras de conversão reproduzem 157 dos 157 casos nos portes pequenos e 28 dos 30 nos grandes; a deliberação do conselho e a resolução da SEDEF converteram o ranqueamento em lista pública com suplentes; e a adesão, a habilitação e o repasse fundo a fundo converteram a lista em investimento. A história institucional é parte do mecanismo: sem a aprovação pelo conselho e a publicação em resolução, o índice teria permanecido um diagnóstico.</w:t>
+        <w:t>A Figura 6 resume o mecanismo que liga as evidências à alocação, com cada elo verificado: fórmulas e fontes reproduzidas; índice estável a pesos e normalização; regras de conversão reproduzidas em 157 dos 157 casos nos portes pequenos e 28 dos 30 nos grandes; ranqueamento convertido em lista pública com suplentes pela deliberação do conselho e pela resolução; e lista convertida em investimento pela adesão, habilitação e repasse. A história institucional é parte do mecanismo: sem a aprovação pelo conselho e a publicação em resolução, o índice teria permanecido um diagnóstico.</w:t>
       </w:r>
     </w:p>
     <w:p>
@@ -18493,7 +18190,7 @@
           <w:i w:val="0"/>
           <w:sz w:val="24"/>
         </w:rPr>
-        <w:t>O caso mostra que o desenho metodológico foi parte substantiva da política pública, porque definiu sua territorialização. Três lições decorrem dele. A primeira é que o índice resolve o problema da medida e a regra de conversão resolve o problema da unidade: um município com PCM de 0,46 recebe uma creche na faixa de 5 a 20 mil habitantes, nenhuma na faixa de 20 a 70 mil e uma fração de cota entre os 30 grandes. A regra de conversão merece a mesma documentação que o índice, porque é nela que estão as escolhas sobre cobertura mínima e concentração. A segunda é a transversalidade: a necessidade foi medida com dados da educação, da saúde, da assistência social e da economia regional, e a decisão percorreu a Casa Civil, o Ipardes, o conselho paritário, a SEDEF, o Paranacidade, a Assembleia Legislativa e os municípios. O município pequeno recebe, além do recurso, o projeto, o orçamento e a análise técnica, e o repasse por marco físico limita o risco de obra inacabada. A terceira é que a transparência organiza a dimensão político-institucional: publicada a fórmula e a lista, a margem de decisão ficou restrita a tetos e a municípios próximos à linha de corte, onde as diferenças de PCM são de centésimos e estão dentro da imprecisão de qualquer indicador composto (OECD; JRC, 2008), e informações que o índice não capta, como terreno, capacidade de licitar e fila local, tiveram entrada delimitada.</w:t>
+        <w:t>O caso mostra que o desenho metodológico foi parte substantiva da política pública, porque definiu sua territorialização. Três lições decorrem dele. A primeira é que o índice resolve o problema da medida e a regra de conversão resolve o problema da unidade: um município com PCM de 0,46 recebe uma creche na faixa de 5 a 20 mil habitantes, nenhuma na faixa de 20 a 70 mil e uma fração de cota entre os 30 grandes; a regra merece a mesma documentação que o índice. A segunda é a transversalidade: a necessidade foi medida com dados da educação, da saúde, da assistência social e da economia regional, e a decisão percorreu a Casa Civil, o Ipardes, o conselho paritário, a SEDEF, o Paranacidade, a Assembleia Legislativa e os municípios, que recebem, além do recurso, o projeto, o orçamento e a análise técnica. A terceira é que a transparência organiza a dimensão político-institucional: publicada a fórmula e a lista, a margem de decisão ficou restrita a tetos e a municípios próximos à linha de corte, onde as diferenças de PCM são de centésimos, dentro da imprecisão de qualquer indicador composto (OECD; JRC, 2008), e informações que o índice não capta, como terreno, capacidade de licitar e fila local, tiveram entrada delimitada.</w:t>
       </w:r>
     </w:p>
     <w:p>
@@ -18510,7 +18207,7 @@
           <w:i w:val="0"/>
           <w:sz w:val="24"/>
         </w:rPr>
-        <w:t>A qualidade da alocação importa para o desenvolvimento. A literatura de economia política mostra que a distribuição territorial de investimentos públicos responde a incentivos eleitorais e a barganhas entre níveis de governo, e que regras explícitas e verificáveis reduzem o espaço para alocações clientelistas e elevam a eficiência distributiva do gasto ([[EJDR]]). Uma regra pública de alocação é um bem em si: o prefeito sabe por que seu município foi ou não contemplado, conhece sua posição na fila e pode planejar o custeio de uma unidade cuja localização foi decidida com dados que ele mesmo pode verificar. A cronologia posterior ao anúncio, registrada pela Agência Estadual de Notícias e replicada pela imprensa regional, mostra a passagem da lista à execução: adesão de 258 municípios em duas semanas, primeiros repasses em 2024, 107 licitações autorizadas em outubro de 2025 e 110 obras em andamento em maio de 2026.</w:t>
+        <w:t>A qualidade da alocação importa para o desenvolvimento. A literatura de economia política mostra que a alocação do gasto público entre investimentos de alto retorno responde aos incentivos e restrições de políticos, burocratas e grupos de interesse, às características dos bens providos e ao ambiente de governança, o que explica por que investimentos de retorno elevado podem ser negligenciados nas carteiras orçamentárias (MOGUES, 2015, p. 452-456); regras explícitas e verificáveis reduzem o espaço para alocações discricionárias e aproximam a distribuição do gasto de sua justificativa técnica. Uma regra pública de alocação é um bem em si: o prefeito sabe por que seu município foi ou não contemplado, conhece sua posição na fila e pode planejar o custeio de uma unidade cuja localização foi decidida com dados que ele mesmo pode verificar. A cronologia posterior ao anúncio, registrada pela Agência Estadual de Notícias e replicada pela imprensa regional, mostra a passagem da lista à execução: adesão de 258 municípios em duas semanas, primeiros repasses em 2024, 107 licitações autorizadas em outubro de 2025 e 110 obras em andamento em maio de 2026.</w:t>
       </w:r>
       <w:r>
         <w:rPr>
@@ -18583,7 +18280,7 @@
           <w:i w:val="0"/>
           <w:sz w:val="24"/>
         </w:rPr>
-        <w:t>ATTANASIO, O.; CATTAN, S.; MEGHIR, C. Early childhood development, human capital, and poverty. Annual Review of Economics, v. 14, p. 853-892, 2022.</w:t>
+        <w:t>ATTANASIO, O.; BARROS, R. P. de; CARNEIRO, P.; EVANS, D. K.; LIMA, L.; OLINTO, P.; SCHADY, N. Public childcare, labor market outcomes of caregivers, and child development: experimental evidence from Brazil. Cambridge, MA: National Bureau of Economic Research, 2022. (NBER Working Paper, 30653). DOI: 10.3386/w30653.</w:t>
       </w:r>
     </w:p>
     <w:p>
@@ -18600,7 +18297,7 @@
           <w:i w:val="0"/>
           <w:sz w:val="24"/>
         </w:rPr>
-        <w:t>[[REF_NBER]]</w:t>
+        <w:t>ATTANASIO, O.; CATTAN, S.; MEGHIR, C. Early childhood development, human capital, and poverty. Annual Review of Economics, Palo Alto, v. 14, n. 1, p. 853-892, 2022. DOI: 10.1146/annurev-economics-092821-053234.</w:t>
       </w:r>
     </w:p>
     <w:p>
@@ -18753,7 +18450,7 @@
           <w:i w:val="0"/>
           <w:sz w:val="24"/>
         </w:rPr>
-        <w:t>BRASIL. Ministério da Saúde. Sistema de Vigilância Alimentar e Nutricional (Sisvan) e acompanhamento das condicionalidades de saúde do Programa Bolsa Família: relatórios públicos de 2023. Brasília, DF: Ministério da Saúde, 2024. Disponível em: https://sisaps.saude.gov.br/sisvan/. Acesso em: 28 set. 2026.</w:t>
+        <w:t>BRASIL. Ministério da Saúde. Sistema de Vigilância Alimentar e Nutricional (Sisvan) e acompanhamento das condicionalidades de saúde do Programa Bolsa Família: relatórios públicos de 2023. Brasília, DF: Ministério da Saúde, 2024. Disponível em: https://sisaps.saude.gov.br/sisvan/relatoriopublico/index. Acesso em: 28 set. 2026.</w:t>
       </w:r>
     </w:p>
     <w:p>
@@ -18872,6 +18569,23 @@
           <w:i w:val="0"/>
           <w:sz w:val="24"/>
         </w:rPr>
+        <w:t>DATASUS. Sistema de Informações sobre Mortalidade e Sistema de Informações sobre Nascidos Vivos: óbitos infantis e nascidos vivos por unidade da federação, 2023 (Tabnet). Brasília, DF: Ministério da Saúde, 2025. Disponível em: http://tabnet.datasus.gov.br/cgi/deftohtm.exe?sim/cnv/inf10uf.def. Acesso em: 29 set. 2026.</w:t>
+      </w:r>
+    </w:p>
+    <w:p>
+      <w:pPr>
+        <w:keepNext w:val="0"/>
+        <w:spacing w:line="240" w:lineRule="auto" w:after="80" w:before="0"/>
+        <w:ind w:firstLine="0"/>
+        <w:jc w:val="left"/>
+      </w:pPr>
+      <w:r>
+        <w:rPr>
+          <w:rFonts w:ascii="Arial" w:hAnsi="Arial"/>
+          <w:b w:val="0"/>
+          <w:i w:val="0"/>
+          <w:sz w:val="24"/>
+        </w:rPr>
         <w:t>DEVERCELLI, A. E.; BEATON-DAY, F. Better jobs and brighter futures: investing in childcare to build human capital. Washington, DC: The World Bank, 2020.</w:t>
       </w:r>
     </w:p>
@@ -18889,24 +18603,7 @@
           <w:i w:val="0"/>
           <w:sz w:val="24"/>
         </w:rPr>
-        <w:t>[[REF_EJDR]]</w:t>
-      </w:r>
-    </w:p>
-    <w:p>
-      <w:pPr>
-        <w:keepNext w:val="0"/>
-        <w:spacing w:line="240" w:lineRule="auto" w:after="80" w:before="0"/>
-        <w:ind w:firstLine="0"/>
-        <w:jc w:val="left"/>
-      </w:pPr>
-      <w:r>
-        <w:rPr>
-          <w:rFonts w:ascii="Arial" w:hAnsi="Arial"/>
-          <w:b w:val="0"/>
-          <w:i w:val="0"/>
-          <w:sz w:val="24"/>
-        </w:rPr>
-        <w:t>FRANSEN, L.; DEL BUFALO, G.; REVIGLIO, E. Boosting investment in social infrastructure in Europe: report of the High-Level Task Force on Investing in Social Infrastructure in Europe. Luxembourg: Publications Office of the European Union, 2018. (European Economy Discussion Paper, 74).</w:t>
+        <w:t>FRANSEN, L.; DEL BUFALO, G.; REVIGLIO, E. Boosting investment in social infrastructure in Europe: report of the High-Level Task Force on Investing in Social Infrastructure in Europe. Luxembourg: European Commission, Directorate-General for Economic and Financial Affairs, 2018. (European Economy Discussion Paper, 74). DOI: 10.2765/794497.</w:t>
       </w:r>
     </w:p>
     <w:p>
@@ -18957,7 +18654,7 @@
           <w:i w:val="0"/>
           <w:sz w:val="24"/>
         </w:rPr>
-        <w:t>IBGE. Censo Demográfico 2022: população por idade e sexo. Rio de Janeiro: IBGE, 2023a.</w:t>
+        <w:t>IBGE. Censo Demográfico 2022: população por idade e sexo, resultados do universo (tabela 9514). Rio de Janeiro: IBGE, 2023a. Disponível em: https://sidra.ibge.gov.br/tabela/9514. Acesso em: 29 set. 2026.</w:t>
       </w:r>
     </w:p>
     <w:p>
@@ -18991,7 +18688,7 @@
           <w:i w:val="0"/>
           <w:sz w:val="24"/>
         </w:rPr>
-        <w:t>IBGE. Pesquisa Nacional por Amostra de Domicílios Contínua: educação 2024. Rio de Janeiro: IBGE, 2025.</w:t>
+        <w:t>IBGE. Pesquisa Nacional por Amostra de Domicílios Contínua: educação 2024. Rio de Janeiro: IBGE, 2025a.</w:t>
       </w:r>
     </w:p>
     <w:p>
@@ -19008,7 +18705,7 @@
           <w:i w:val="0"/>
           <w:sz w:val="24"/>
         </w:rPr>
-        <w:t>INEP. Censo Escolar da Educação Básica 2023: sinopse estatística. Brasília, DF: Inep, 2024. Disponível em: https://www.gov.br/inep/pt-br/acesso-a-informacao/dados-abertos/sinopses-estatisticas/educacao-basica. Acesso em: 28 set. 2026.</w:t>
+        <w:t>IBGE. Rendimento domiciliar per capita 2024: Brasil e unidades da federação. Rio de Janeiro: IBGE, 2025b.</w:t>
       </w:r>
     </w:p>
     <w:p>
@@ -19025,7 +18722,7 @@
           <w:i w:val="0"/>
           <w:sz w:val="24"/>
         </w:rPr>
-        <w:t>IPARDES. Índice Ipardes de Desempenho Municipal (IPDM) 2021: nota metodológica e resultados. Curitiba: Ipardes, 2023.</w:t>
+        <w:t>IJSN. Instituto Jones dos Santos Neves. Pobreza nos estados brasileiros 2024. Vitória: IJSN, 2025. Disponível em: https://ijsn.es.gov.br/. Acesso em: 29 set. 2026.</w:t>
       </w:r>
     </w:p>
     <w:p>
@@ -19042,7 +18739,41 @@
           <w:i w:val="0"/>
           <w:sz w:val="24"/>
         </w:rPr>
-        <w:t>IPARDES. Base de Dados do Estado (BDEweb): taxa bruta de natalidade por município, 2022. Curitiba: Ipardes, 2024. Disponível em: https://www.ipardes.pr.gov.br/. Acesso em: 28 set. 2026.</w:t>
+        <w:t>INEP. Sinopse Estatística da Educação Básica 2023. Brasília, DF: Inep, 2024. Disponível em: https://www.gov.br/inep/pt-br/acesso-a-informacao/dados-abertos/sinopses-estatisticas/educacao-basica. Acesso em: 28 set. 2026.</w:t>
+      </w:r>
+    </w:p>
+    <w:p>
+      <w:pPr>
+        <w:keepNext w:val="0"/>
+        <w:spacing w:line="240" w:lineRule="auto" w:after="80" w:before="0"/>
+        <w:ind w:firstLine="0"/>
+        <w:jc w:val="left"/>
+      </w:pPr>
+      <w:r>
+        <w:rPr>
+          <w:rFonts w:ascii="Arial" w:hAnsi="Arial"/>
+          <w:b w:val="0"/>
+          <w:i w:val="0"/>
+          <w:sz w:val="24"/>
+        </w:rPr>
+        <w:t>IPARDES. Índice Ipardes de Desempenho Municipal (IPDM): resultados 2021. Curitiba: Ipardes, 2024a. Disponível em: https://www.ipardes.pr.gov.br/Pagina/Indice-Ipardes-de-Desempenho-Municipal-0. Acesso em: 29 set. 2026.</w:t>
+      </w:r>
+    </w:p>
+    <w:p>
+      <w:pPr>
+        <w:keepNext w:val="0"/>
+        <w:spacing w:line="240" w:lineRule="auto" w:after="80" w:before="0"/>
+        <w:ind w:firstLine="0"/>
+        <w:jc w:val="left"/>
+      </w:pPr>
+      <w:r>
+        <w:rPr>
+          <w:rFonts w:ascii="Arial" w:hAnsi="Arial"/>
+          <w:b w:val="0"/>
+          <w:i w:val="0"/>
+          <w:sz w:val="24"/>
+        </w:rPr>
+        <w:t>IPARDES. Base de Dados do Estado (BDEweb): taxa bruta de natalidade por município, 2022. Curitiba: Ipardes, 2024b. Disponível em: https://www.ipardes.pr.gov.br/Pagina/Base-de-Dados-do-Estado. Acesso em: 29 set. 2026.</w:t>
       </w:r>
     </w:p>
     <w:p>
@@ -19060,6 +18791,23 @@
           <w:sz w:val="24"/>
         </w:rPr>
         <w:t>MELO, Y. M.; GOMES, S. C. A implementação do Proinfância sob a ótica das relações intergovernamentais. Revista Ibero-Americana de Estudos em Educação, Araraquara, v. 17, n. esp. 3, p. 2118-2138, 2022.</w:t>
+      </w:r>
+    </w:p>
+    <w:p>
+      <w:pPr>
+        <w:keepNext w:val="0"/>
+        <w:spacing w:line="240" w:lineRule="auto" w:after="80" w:before="0"/>
+        <w:ind w:firstLine="0"/>
+        <w:jc w:val="left"/>
+      </w:pPr>
+      <w:r>
+        <w:rPr>
+          <w:rFonts w:ascii="Arial" w:hAnsi="Arial"/>
+          <w:b w:val="0"/>
+          <w:i w:val="0"/>
+          <w:sz w:val="24"/>
+        </w:rPr>
+        <w:t>MOGUES, T. Political economy determinants of public spending allocations: a review of theories, and implications for agricultural public investment. The European Journal of Development Research, London, v. 27, n. 3, p. 452-473, 2015. DOI: 10.1057/ejdr.2015.35.</w:t>
       </w:r>
     </w:p>
     <w:p>
@@ -19127,7 +18875,7 @@
           <w:i w:val="0"/>
           <w:sz w:val="24"/>
         </w:rPr>
-        <w:t>OECD; JRC. Handbook on constructing composite indicators: methodology and user guide. Paris: OECD Publishing, 2008. Disponível em: https://www.oecd.org/en/publications/handbook-on-constructing-composite-indicators-methodology-and-user-guide_9789264043466-en.html. Acesso em: 28 set. 2026.</w:t>
+        <w:t>OECD; JRC. Organisation for Economic Co-operation and Development; European Commission Joint Research Centre. Handbook on constructing composite indicators: methodology and user guide. Paris: OECD Publishing, 2008. DOI: 10.1787/9789264043466-en. Disponível em: https://www.oecd.org/en/publications/handbook-on-constructing-composite-indicators-methodology-and-user-guide_9789264043466-en.html. Acesso em: 28 set. 2026.</w:t>
       </w:r>
     </w:p>
     <w:p>
@@ -19331,7 +19079,24 @@
           <w:i w:val="0"/>
           <w:sz w:val="24"/>
         </w:rPr>
-        <w:t>TODOS PELA EDUCAÇÃO. Panorama do acesso à educação infantil no Brasil. São Paulo: Todos pela Educação, 2025.</w:t>
+        <w:t>TODOS PELA EDUCAÇÃO. Panorama do acesso à educação infantil no Brasil. São Paulo: Todos pela Educação, 2025a.</w:t>
+      </w:r>
+    </w:p>
+    <w:p>
+      <w:pPr>
+        <w:keepNext w:val="0"/>
+        <w:spacing w:line="240" w:lineRule="auto" w:after="80" w:before="0"/>
+        <w:ind w:firstLine="0"/>
+        <w:jc w:val="left"/>
+      </w:pPr>
+      <w:r>
+        <w:rPr>
+          <w:rFonts w:ascii="Arial" w:hAnsi="Arial"/>
+          <w:b w:val="0"/>
+          <w:i w:val="0"/>
+          <w:sz w:val="24"/>
+        </w:rPr>
+        <w:t>TODOS PELA EDUCAÇÃO. Anuário Brasileiro da Educação Básica 2025: educação infantil. São Paulo: Todos pela Educação, 2025b. Disponível em: https://anuario.todospelaeducacao.org.br/2025/capitulo-1-educacao-infantil.html. Acesso em: 29 set. 2026.</w:t>
       </w:r>
     </w:p>
     <w:p>
@@ -19436,7 +19201,7 @@
           <w:rFonts w:ascii="Arial" w:hAnsi="Arial"/>
           <w:sz w:val="20"/>
         </w:rPr>
-        <w:t xml:space="preserve"> [[NOTA_NOTICIAS]]</w:t>
+        <w:t xml:space="preserve"> As matérias da Agência Estadual de Notícias foram replicadas pela imprensa regional; para os trechos citados, consultamos Bem Paraná e CBN Londrina (10 jun. 2024, anúncio das 300 creches em 258 municípios), Paiquerê (18 jun. 2024, prazo de adesão), Diário do Sudoeste (15 out. 2025, 107 licitações autorizadas em 97 municípios e R$ 74,7 milhões repassados), Agora Paraná (27 fev. 2026, 48 obras em andamento e 108 unidades autorizadas em 2025) e Tribuna de Cianorte (24 maio 2026, 110 obras em construção), mantendo nas referências os títulos e as datas originais.</w:t>
       </w:r>
     </w:p>
   </w:footnote>

</xml_diff>

<commit_message>
Seção 4.1 reescrita em três blocos (doc separado e artigo), correção do conversor OMML e subscritos em prosa
Co-Authored-By: Claude Fable 5.1 <noreply@anthropic.com>
Claude-Session: https://claude.ai/code/session_01MDzyNreLrve5brDgfNKZ3e
</commit_message>
<xml_diff>
--- a/creches-parana/08_artigo/artigo_creches_parana_anonimizado.docx
+++ b/creches-parana/08_artigo/artigo_creches_parana_anonimizado.docx
@@ -5317,13 +5317,19 @@
                 </m:r>
               </m:e>
             </m:d>
+            <m:r>
+              <w:rPr>
+                <w:rFonts w:ascii="Cambria Math" w:hAnsi="Cambria Math"/>
+              </w:rPr>
+              <m:t xml:space="preserve"> - </m:t>
+            </m:r>
             <m:sSub>
               <m:e>
                 <m:r>
                   <w:rPr>
                     <w:rFonts w:ascii="Cambria Math" w:hAnsi="Cambria Math"/>
                   </w:rPr>
-                  <m:t xml:space="preserve"> - x</m:t>
+                  <m:t xml:space="preserve">x</m:t>
                 </m:r>
               </m:e>
               <m:sub>
@@ -8591,13 +8597,19 @@
               </w:rPr>
               <m:t xml:space="preserve">·</m:t>
             </m:r>
+            <m:r>
+              <w:rPr>
+                <w:rFonts w:ascii="Cambria Math" w:hAnsi="Cambria Math"/>
+              </w:rPr>
+              <m:t xml:space="preserve"> </m:t>
+            </m:r>
             <m:sSub>
               <m:e>
                 <m:r>
                   <w:rPr>
                     <w:rFonts w:ascii="Cambria Math" w:hAnsi="Cambria Math"/>
                   </w:rPr>
-                  <m:t xml:space="preserve"> F</m:t>
+                  <m:t xml:space="preserve">F</m:t>
                 </m:r>
               </m:e>
               <m:sub>
@@ -8609,13 +8621,19 @@
                 </m:r>
               </m:sub>
             </m:sSub>
+            <m:r>
+              <w:rPr>
+                <w:rFonts w:ascii="Cambria Math" w:hAnsi="Cambria Math"/>
+              </w:rPr>
+              <m:t xml:space="preserve"> + </m:t>
+            </m:r>
             <m:sSub>
               <m:e>
                 <m:r>
                   <w:rPr>
                     <w:rFonts w:ascii="Cambria Math" w:hAnsi="Cambria Math"/>
                   </w:rPr>
-                  <m:t xml:space="preserve"> + F</m:t>
+                  <m:t xml:space="preserve">F</m:t>
                 </m:r>
               </m:e>
               <m:sub>
@@ -8639,13 +8657,19 @@
               </w:rPr>
               <m:t xml:space="preserve">·</m:t>
             </m:r>
+            <m:r>
+              <w:rPr>
+                <w:rFonts w:ascii="Cambria Math" w:hAnsi="Cambria Math"/>
+              </w:rPr>
+              <m:t xml:space="preserve"> </m:t>
+            </m:r>
             <m:sSub>
               <m:e>
                 <m:r>
                   <w:rPr>
                     <w:rFonts w:ascii="Cambria Math" w:hAnsi="Cambria Math"/>
                   </w:rPr>
-                  <m:t xml:space="preserve"> F</m:t>
+                  <m:t xml:space="preserve">F</m:t>
                 </m:r>
               </m:e>
               <m:sub>
@@ -9925,7 +9949,901 @@
           <w:i w:val="0"/>
           <w:sz w:val="24"/>
         </w:rPr>
-        <w:t>Definido e verificado o índice, restava decidir como ele se converteria em unidades. O índice ordena os municípios, mas não diz quantas unidades cada um recebe. A segunda fase da metodologia classificou os municípios em oito faixas de porte pela população de 2022 e aplicou dois regimes: proporcionalidade corrigida pelo índice entre os 30 municípios das cinco faixas superiores, e ranqueamento pelo índice, com uma unidade por município, nas três faixas inferiores (Figura 5). Na versão apresentada ao conselho, com N* = 257 unidades a distribuir após as 43 da etapa prévia definida pelo índice de prioridade do Ipardes, a cota de cada porte é proporcional à sua parcela s_p na população-alvo, reduzida pelo fator 1 + m, em que m é o PCM médio ponderado (0,503):</w:t>
+        <w:t>Definido e verificado o índice, restava decidir como ele se converteria em unidades. O PCM ordena os municípios, mas não diz quantas unidades cada um deve receber. Para converter o ordenamento em uma distribuição, o programa dividiu as 300 unidades em três blocos, definidos em momentos e por regras diferentes (Figura 5). O primeiro são 43 unidades de uma etapa prévia, aprovada pelo conselho antes do PCM. O segundo são 100 unidades para os 30 municípios das cinco faixas superiores de porte, repartidas na proporção da população-alvo, corrigidas pelo PCM e limitadas por tetos. O terceiro são 157 unidades para os 369 municípios das três faixas inferiores, atribuídas por ranqueamento do PCM dentro de cada faixa, uma unidade por município. Os dois regimes respondem a uma diferença de escala: em uma cidade grande, uma unidade atende a uma fração pequena das crianças, e faz sentido repartir várias unidades na proporção da população; em um município pequeno, uma unidade já altera a cobertura, e a decisão relevante é quem entra na lista.</w:t>
+      </w:r>
+    </w:p>
+    <w:p>
+      <w:pPr>
+        <w:keepNext/>
+        <w:spacing w:line="240" w:lineRule="auto" w:after="60" w:before="160"/>
+        <w:ind w:firstLine="0"/>
+        <w:jc w:val="left"/>
+      </w:pPr>
+      <w:r>
+        <w:rPr>
+          <w:rFonts w:ascii="Arial" w:hAnsi="Arial"/>
+          <w:b w:val="0"/>
+          <w:i w:val="0"/>
+          <w:sz w:val="22"/>
+        </w:rPr>
+        <w:t>Figura 5. Da cota populacional às unidades inteiras: os três blocos da distribuição</w:t>
+      </w:r>
+    </w:p>
+    <w:tbl>
+      <w:tblPr>
+        <w:tblW w:type="auto" w:w="0"/>
+        <w:jc w:val="center"/>
+        <w:tblLayout w:type="fixed"/>
+        <w:tblLook w:firstColumn="1" w:firstRow="1" w:lastColumn="0" w:lastRow="0" w:noHBand="0" w:noVBand="1" w:val="04A0"/>
+        <w:tblLayout w:type="fixed"/>
+        <w:tblW w:w="9072" w:type="dxa"/>
+      </w:tblPr>
+      <w:tblGrid>
+        <w:gridCol w:w="2948"/>
+        <w:gridCol w:w="113"/>
+        <w:gridCol w:w="2948"/>
+        <w:gridCol w:w="113"/>
+        <w:gridCol w:w="2948"/>
+      </w:tblGrid>
+      <w:tr>
+        <w:trPr>
+          <w:cantSplit/>
+        </w:trPr>
+        <w:tc>
+          <w:tcPr>
+            <w:tcW w:type="dxa" w:w="2948"/>
+            <w:shd w:val="clear" w:color="auto" w:fill="307E3E"/>
+            <w:tcBorders>
+              <w:top w:val="single" w:sz="8" w:color="7F7F7F"/>
+              <w:left w:val="single" w:sz="8" w:color="7F7F7F"/>
+              <w:bottom w:val="single" w:sz="8" w:color="7F7F7F"/>
+              <w:right w:val="single" w:sz="8" w:color="7F7F7F"/>
+            </w:tcBorders>
+            <w:vAlign w:val="center"/>
+            <w:tcMar>
+              <w:top w:w="30" w:type="dxa"/>
+              <w:bottom w:w="30" w:type="dxa"/>
+              <w:left w:w="50" w:type="dxa"/>
+              <w:right w:w="50" w:type="dxa"/>
+            </w:tcMar>
+          </w:tcPr>
+          <w:p>
+            <w:pPr>
+              <w:spacing w:after="0" w:before="0" w:line="240" w:lineRule="auto"/>
+              <w:ind w:firstLine="0" w:left="0"/>
+              <w:jc w:val="center"/>
+            </w:pPr>
+            <w:r>
+              <w:rPr>
+                <w:rFonts w:ascii="Arial" w:hAnsi="Arial"/>
+                <w:b/>
+                <w:color w:val="FFFFFF"/>
+                <w:sz w:val="16"/>
+              </w:rPr>
+              <w:t>Bloco 1. Etapa prévia</w:t>
+            </w:r>
+          </w:p>
+          <w:p>
+            <w:pPr>
+              <w:spacing w:after="0" w:before="0" w:line="240" w:lineRule="auto"/>
+              <w:ind w:firstLine="0" w:left="0"/>
+              <w:jc w:val="center"/>
+            </w:pPr>
+            <w:r>
+              <w:rPr>
+                <w:rFonts w:ascii="Arial" w:hAnsi="Arial"/>
+                <w:b w:val="0"/>
+                <w:color w:val="FFFFFF"/>
+                <w:sz w:val="16"/>
+              </w:rPr>
+              <w:t>43 unidades</w:t>
+            </w:r>
+          </w:p>
+        </w:tc>
+        <w:tc>
+          <w:tcPr>
+            <w:tcW w:type="dxa" w:w="113"/>
+            <w:shd w:val="clear" w:color="auto" w:fill="FFFFFF"/>
+            <w:tcBorders>
+              <w:top w:val="nil" w:sz="8" w:color="FFFFFF"/>
+              <w:left w:val="nil" w:sz="8" w:color="FFFFFF"/>
+              <w:bottom w:val="nil" w:sz="8" w:color="FFFFFF"/>
+              <w:right w:val="nil" w:sz="8" w:color="FFFFFF"/>
+            </w:tcBorders>
+            <w:vAlign w:val="center"/>
+            <w:tcMar>
+              <w:top w:w="30" w:type="dxa"/>
+              <w:bottom w:w="30" w:type="dxa"/>
+              <w:left w:w="50" w:type="dxa"/>
+              <w:right w:w="50" w:type="dxa"/>
+            </w:tcMar>
+          </w:tcPr>
+          <w:p/>
+        </w:tc>
+        <w:tc>
+          <w:tcPr>
+            <w:tcW w:type="dxa" w:w="2948"/>
+            <w:shd w:val="clear" w:color="auto" w:fill="54278F"/>
+            <w:tcBorders>
+              <w:top w:val="single" w:sz="8" w:color="7F7F7F"/>
+              <w:left w:val="single" w:sz="8" w:color="7F7F7F"/>
+              <w:bottom w:val="single" w:sz="8" w:color="7F7F7F"/>
+              <w:right w:val="single" w:sz="8" w:color="7F7F7F"/>
+            </w:tcBorders>
+            <w:vAlign w:val="center"/>
+            <w:tcMar>
+              <w:top w:w="30" w:type="dxa"/>
+              <w:bottom w:w="30" w:type="dxa"/>
+              <w:left w:w="50" w:type="dxa"/>
+              <w:right w:w="50" w:type="dxa"/>
+            </w:tcMar>
+          </w:tcPr>
+          <w:p>
+            <w:pPr>
+              <w:spacing w:after="0" w:before="0" w:line="240" w:lineRule="auto"/>
+              <w:ind w:firstLine="0" w:left="0"/>
+              <w:jc w:val="center"/>
+            </w:pPr>
+            <w:r>
+              <w:rPr>
+                <w:rFonts w:ascii="Arial" w:hAnsi="Arial"/>
+                <w:b/>
+                <w:color w:val="FFFFFF"/>
+                <w:sz w:val="16"/>
+              </w:rPr>
+              <w:t>Bloco 2. Portes grandes</w:t>
+            </w:r>
+          </w:p>
+          <w:p>
+            <w:pPr>
+              <w:spacing w:after="0" w:before="0" w:line="240" w:lineRule="auto"/>
+              <w:ind w:firstLine="0" w:left="0"/>
+              <w:jc w:val="center"/>
+            </w:pPr>
+            <w:r>
+              <w:rPr>
+                <w:rFonts w:ascii="Arial" w:hAnsi="Arial"/>
+                <w:b w:val="0"/>
+                <w:color w:val="FFFFFF"/>
+                <w:sz w:val="16"/>
+              </w:rPr>
+              <w:t>30 municípios, 100 unidades</w:t>
+            </w:r>
+          </w:p>
+        </w:tc>
+        <w:tc>
+          <w:tcPr>
+            <w:tcW w:type="dxa" w:w="113"/>
+            <w:shd w:val="clear" w:color="auto" w:fill="FFFFFF"/>
+            <w:tcBorders>
+              <w:top w:val="nil" w:sz="8" w:color="FFFFFF"/>
+              <w:left w:val="nil" w:sz="8" w:color="FFFFFF"/>
+              <w:bottom w:val="nil" w:sz="8" w:color="FFFFFF"/>
+              <w:right w:val="nil" w:sz="8" w:color="FFFFFF"/>
+            </w:tcBorders>
+            <w:vAlign w:val="center"/>
+            <w:tcMar>
+              <w:top w:w="30" w:type="dxa"/>
+              <w:bottom w:w="30" w:type="dxa"/>
+              <w:left w:w="50" w:type="dxa"/>
+              <w:right w:w="50" w:type="dxa"/>
+            </w:tcMar>
+          </w:tcPr>
+          <w:p/>
+        </w:tc>
+        <w:tc>
+          <w:tcPr>
+            <w:tcW w:type="dxa" w:w="2948"/>
+            <w:shd w:val="clear" w:color="auto" w:fill="595959"/>
+            <w:tcBorders>
+              <w:top w:val="single" w:sz="8" w:color="7F7F7F"/>
+              <w:left w:val="single" w:sz="8" w:color="7F7F7F"/>
+              <w:bottom w:val="single" w:sz="8" w:color="7F7F7F"/>
+              <w:right w:val="single" w:sz="8" w:color="7F7F7F"/>
+            </w:tcBorders>
+            <w:vAlign w:val="center"/>
+            <w:tcMar>
+              <w:top w:w="30" w:type="dxa"/>
+              <w:bottom w:w="30" w:type="dxa"/>
+              <w:left w:w="50" w:type="dxa"/>
+              <w:right w:w="50" w:type="dxa"/>
+            </w:tcMar>
+          </w:tcPr>
+          <w:p>
+            <w:pPr>
+              <w:spacing w:after="0" w:before="0" w:line="240" w:lineRule="auto"/>
+              <w:ind w:firstLine="0" w:left="0"/>
+              <w:jc w:val="center"/>
+            </w:pPr>
+            <w:r>
+              <w:rPr>
+                <w:rFonts w:ascii="Arial" w:hAnsi="Arial"/>
+                <w:b/>
+                <w:color w:val="FFFFFF"/>
+                <w:sz w:val="16"/>
+              </w:rPr>
+              <w:t>Bloco 3. Portes pequenos</w:t>
+            </w:r>
+          </w:p>
+          <w:p>
+            <w:pPr>
+              <w:spacing w:after="0" w:before="0" w:line="240" w:lineRule="auto"/>
+              <w:ind w:firstLine="0" w:left="0"/>
+              <w:jc w:val="center"/>
+            </w:pPr>
+            <w:r>
+              <w:rPr>
+                <w:rFonts w:ascii="Arial" w:hAnsi="Arial"/>
+                <w:b w:val="0"/>
+                <w:color w:val="FFFFFF"/>
+                <w:sz w:val="16"/>
+              </w:rPr>
+              <w:t>369 municípios, 157 unidades</w:t>
+            </w:r>
+          </w:p>
+        </w:tc>
+      </w:tr>
+      <w:tr>
+        <w:trPr>
+          <w:cantSplit/>
+        </w:trPr>
+        <w:tc>
+          <w:tcPr>
+            <w:tcW w:type="dxa" w:w="2948"/>
+            <w:shd w:val="clear" w:color="auto" w:fill="FFFFFF"/>
+            <w:tcBorders>
+              <w:top w:val="single" w:sz="8" w:color="307E3E"/>
+              <w:left w:val="single" w:sz="8" w:color="307E3E"/>
+              <w:bottom w:val="single" w:sz="8" w:color="307E3E"/>
+              <w:right w:val="single" w:sz="8" w:color="307E3E"/>
+            </w:tcBorders>
+            <w:vAlign w:val="center"/>
+            <w:tcMar>
+              <w:top w:w="30" w:type="dxa"/>
+              <w:bottom w:w="30" w:type="dxa"/>
+              <w:left w:w="50" w:type="dxa"/>
+              <w:right w:w="50" w:type="dxa"/>
+            </w:tcMar>
+          </w:tcPr>
+          <w:p>
+            <w:pPr>
+              <w:spacing w:after="0" w:before="0" w:line="240" w:lineRule="auto"/>
+              <w:ind w:firstLine="0" w:left="0"/>
+              <w:jc w:val="center"/>
+            </w:pPr>
+            <w:r>
+              <w:rPr>
+                <w:rFonts w:ascii="Arial" w:hAnsi="Arial"/>
+                <w:b w:val="0"/>
+                <w:color w:val="000000"/>
+                <w:sz w:val="16"/>
+              </w:rPr>
+              <w:t>Deliberação CEDCA 60/2023: índice de prioridade do Ipardes (déficit de vagas, crescimento da população de 0 a 3 anos, crianças com perfil Bolsa Família)</w:t>
+            </w:r>
+          </w:p>
+        </w:tc>
+        <w:tc>
+          <w:tcPr>
+            <w:tcW w:type="dxa" w:w="113"/>
+            <w:shd w:val="clear" w:color="auto" w:fill="FFFFFF"/>
+            <w:tcBorders>
+              <w:top w:val="nil" w:sz="8" w:color="FFFFFF"/>
+              <w:left w:val="nil" w:sz="8" w:color="FFFFFF"/>
+              <w:bottom w:val="nil" w:sz="8" w:color="FFFFFF"/>
+              <w:right w:val="nil" w:sz="8" w:color="FFFFFF"/>
+            </w:tcBorders>
+            <w:vAlign w:val="center"/>
+            <w:tcMar>
+              <w:top w:w="30" w:type="dxa"/>
+              <w:bottom w:w="30" w:type="dxa"/>
+              <w:left w:w="50" w:type="dxa"/>
+              <w:right w:w="50" w:type="dxa"/>
+            </w:tcMar>
+          </w:tcPr>
+          <w:p/>
+        </w:tc>
+        <w:tc>
+          <w:tcPr>
+            <w:tcW w:type="dxa" w:w="2948"/>
+            <w:shd w:val="clear" w:color="auto" w:fill="FFFFFF"/>
+            <w:tcBorders>
+              <w:top w:val="single" w:sz="8" w:color="54278F"/>
+              <w:left w:val="single" w:sz="8" w:color="54278F"/>
+              <w:bottom w:val="single" w:sz="8" w:color="54278F"/>
+              <w:right w:val="single" w:sz="8" w:color="54278F"/>
+            </w:tcBorders>
+            <w:vAlign w:val="center"/>
+            <w:tcMar>
+              <w:top w:w="30" w:type="dxa"/>
+              <w:bottom w:w="30" w:type="dxa"/>
+              <w:left w:w="50" w:type="dxa"/>
+              <w:right w:w="50" w:type="dxa"/>
+            </w:tcMar>
+          </w:tcPr>
+          <w:p>
+            <w:pPr>
+              <w:spacing w:after="0" w:before="0" w:line="240" w:lineRule="auto"/>
+              <w:ind w:firstLine="0" w:left="0"/>
+              <w:jc w:val="center"/>
+            </w:pPr>
+            <w:r>
+              <w:rPr>
+                <w:rFonts w:ascii="Arial" w:hAnsi="Arial"/>
+                <w:b w:val="0"/>
+                <w:color w:val="000000"/>
+                <w:sz w:val="16"/>
+              </w:rPr>
+              <w:t>1. Cota da faixa de porte: parcela na população-alvo × 257 / (1 + 0,503)</w:t>
+            </w:r>
+          </w:p>
+        </w:tc>
+        <w:tc>
+          <w:tcPr>
+            <w:tcW w:type="dxa" w:w="113"/>
+            <w:shd w:val="clear" w:color="auto" w:fill="FFFFFF"/>
+            <w:tcBorders>
+              <w:top w:val="nil" w:sz="8" w:color="FFFFFF"/>
+              <w:left w:val="nil" w:sz="8" w:color="FFFFFF"/>
+              <w:bottom w:val="nil" w:sz="8" w:color="FFFFFF"/>
+              <w:right w:val="nil" w:sz="8" w:color="FFFFFF"/>
+            </w:tcBorders>
+            <w:vAlign w:val="center"/>
+            <w:tcMar>
+              <w:top w:w="30" w:type="dxa"/>
+              <w:bottom w:w="30" w:type="dxa"/>
+              <w:left w:w="50" w:type="dxa"/>
+              <w:right w:w="50" w:type="dxa"/>
+            </w:tcMar>
+          </w:tcPr>
+          <w:p/>
+        </w:tc>
+        <w:tc>
+          <w:tcPr>
+            <w:tcW w:type="dxa" w:w="2948"/>
+            <w:shd w:val="clear" w:color="auto" w:fill="FFFFFF"/>
+            <w:tcBorders>
+              <w:top w:val="single" w:sz="8" w:color="595959"/>
+              <w:left w:val="single" w:sz="8" w:color="595959"/>
+              <w:bottom w:val="single" w:sz="8" w:color="595959"/>
+              <w:right w:val="single" w:sz="8" w:color="595959"/>
+            </w:tcBorders>
+            <w:vAlign w:val="center"/>
+            <w:tcMar>
+              <w:top w:w="30" w:type="dxa"/>
+              <w:bottom w:w="30" w:type="dxa"/>
+              <w:left w:w="50" w:type="dxa"/>
+              <w:right w:w="50" w:type="dxa"/>
+            </w:tcMar>
+          </w:tcPr>
+          <w:p>
+            <w:pPr>
+              <w:spacing w:after="0" w:before="0" w:line="240" w:lineRule="auto"/>
+              <w:ind w:firstLine="0" w:left="0"/>
+              <w:jc w:val="center"/>
+            </w:pPr>
+            <w:r>
+              <w:rPr>
+                <w:rFonts w:ascii="Arial" w:hAnsi="Arial"/>
+                <w:b w:val="0"/>
+                <w:color w:val="000000"/>
+                <w:sz w:val="16"/>
+              </w:rPr>
+              <w:t>1. Ordenação pelo PCM dentro de cada faixa, excluídos os municípios da etapa prévia</w:t>
+            </w:r>
+          </w:p>
+        </w:tc>
+      </w:tr>
+      <w:tr>
+        <w:trPr>
+          <w:cantSplit/>
+        </w:trPr>
+        <w:tc>
+          <w:tcPr>
+            <w:tcW w:type="dxa" w:w="2948"/>
+            <w:shd w:val="clear" w:color="auto" w:fill="FFFFFF"/>
+            <w:tcBorders>
+              <w:top w:val="single" w:sz="8" w:color="307E3E"/>
+              <w:left w:val="single" w:sz="8" w:color="307E3E"/>
+              <w:bottom w:val="single" w:sz="8" w:color="307E3E"/>
+              <w:right w:val="single" w:sz="8" w:color="307E3E"/>
+            </w:tcBorders>
+            <w:vAlign w:val="center"/>
+            <w:tcMar>
+              <w:top w:w="30" w:type="dxa"/>
+              <w:bottom w:w="30" w:type="dxa"/>
+              <w:left w:w="50" w:type="dxa"/>
+              <w:right w:w="50" w:type="dxa"/>
+            </w:tcMar>
+          </w:tcPr>
+          <w:p>
+            <w:pPr>
+              <w:spacing w:after="0" w:before="0" w:line="240" w:lineRule="auto"/>
+              <w:ind w:firstLine="0" w:left="0"/>
+              <w:jc w:val="center"/>
+            </w:pPr>
+            <w:r>
+              <w:rPr>
+                <w:rFonts w:ascii="Arial" w:hAnsi="Arial"/>
+                <w:b w:val="0"/>
+                <w:color w:val="000000"/>
+                <w:sz w:val="16"/>
+              </w:rPr>
+              <w:t>Uma unidade em cada um dos 43 municípios</w:t>
+            </w:r>
+          </w:p>
+        </w:tc>
+        <w:tc>
+          <w:tcPr>
+            <w:tcW w:type="dxa" w:w="113"/>
+            <w:shd w:val="clear" w:color="auto" w:fill="FFFFFF"/>
+            <w:tcBorders>
+              <w:top w:val="nil" w:sz="8" w:color="FFFFFF"/>
+              <w:left w:val="nil" w:sz="8" w:color="FFFFFF"/>
+              <w:bottom w:val="nil" w:sz="8" w:color="FFFFFF"/>
+              <w:right w:val="nil" w:sz="8" w:color="FFFFFF"/>
+            </w:tcBorders>
+            <w:vAlign w:val="center"/>
+            <w:tcMar>
+              <w:top w:w="30" w:type="dxa"/>
+              <w:bottom w:w="30" w:type="dxa"/>
+              <w:left w:w="50" w:type="dxa"/>
+              <w:right w:w="50" w:type="dxa"/>
+            </w:tcMar>
+          </w:tcPr>
+          <w:p/>
+        </w:tc>
+        <w:tc>
+          <w:tcPr>
+            <w:tcW w:type="dxa" w:w="2948"/>
+            <w:shd w:val="clear" w:color="auto" w:fill="FFFFFF"/>
+            <w:tcBorders>
+              <w:top w:val="single" w:sz="8" w:color="54278F"/>
+              <w:left w:val="single" w:sz="8" w:color="54278F"/>
+              <w:bottom w:val="single" w:sz="8" w:color="54278F"/>
+              <w:right w:val="single" w:sz="8" w:color="54278F"/>
+            </w:tcBorders>
+            <w:vAlign w:val="center"/>
+            <w:tcMar>
+              <w:top w:w="30" w:type="dxa"/>
+              <w:bottom w:w="30" w:type="dxa"/>
+              <w:left w:w="50" w:type="dxa"/>
+              <w:right w:w="50" w:type="dxa"/>
+            </w:tcMar>
+          </w:tcPr>
+          <w:p>
+            <w:pPr>
+              <w:spacing w:after="0" w:before="0" w:line="240" w:lineRule="auto"/>
+              <w:ind w:firstLine="0" w:left="0"/>
+              <w:jc w:val="center"/>
+            </w:pPr>
+            <w:r>
+              <w:rPr>
+                <w:rFonts w:ascii="Arial" w:hAnsi="Arial"/>
+                <w:b w:val="0"/>
+                <w:color w:val="000000"/>
+                <w:sz w:val="16"/>
+              </w:rPr>
+              <w:t>2. Cota do município: parcela na população-alvo da faixa × cota da faixa × (1 + PCM), menos a unidade da etapa prévia</w:t>
+            </w:r>
+          </w:p>
+        </w:tc>
+        <w:tc>
+          <w:tcPr>
+            <w:tcW w:type="dxa" w:w="113"/>
+            <w:shd w:val="clear" w:color="auto" w:fill="FFFFFF"/>
+            <w:tcBorders>
+              <w:top w:val="nil" w:sz="8" w:color="FFFFFF"/>
+              <w:left w:val="nil" w:sz="8" w:color="FFFFFF"/>
+              <w:bottom w:val="nil" w:sz="8" w:color="FFFFFF"/>
+              <w:right w:val="nil" w:sz="8" w:color="FFFFFF"/>
+            </w:tcBorders>
+            <w:vAlign w:val="center"/>
+            <w:tcMar>
+              <w:top w:w="30" w:type="dxa"/>
+              <w:bottom w:w="30" w:type="dxa"/>
+              <w:left w:w="50" w:type="dxa"/>
+              <w:right w:w="50" w:type="dxa"/>
+            </w:tcMar>
+          </w:tcPr>
+          <w:p/>
+        </w:tc>
+        <w:tc>
+          <w:tcPr>
+            <w:tcW w:type="dxa" w:w="2948"/>
+            <w:shd w:val="clear" w:color="auto" w:fill="FFFFFF"/>
+            <w:tcBorders>
+              <w:top w:val="single" w:sz="8" w:color="595959"/>
+              <w:left w:val="single" w:sz="8" w:color="595959"/>
+              <w:bottom w:val="single" w:sz="8" w:color="595959"/>
+              <w:right w:val="single" w:sz="8" w:color="595959"/>
+            </w:tcBorders>
+            <w:vAlign w:val="center"/>
+            <w:tcMar>
+              <w:top w:w="30" w:type="dxa"/>
+              <w:bottom w:w="30" w:type="dxa"/>
+              <w:left w:w="50" w:type="dxa"/>
+              <w:right w:w="50" w:type="dxa"/>
+            </w:tcMar>
+          </w:tcPr>
+          <w:p>
+            <w:pPr>
+              <w:spacing w:after="0" w:before="0" w:line="240" w:lineRule="auto"/>
+              <w:ind w:firstLine="0" w:left="0"/>
+              <w:jc w:val="center"/>
+            </w:pPr>
+            <w:r>
+              <w:rPr>
+                <w:rFonts w:ascii="Arial" w:hAnsi="Arial"/>
+                <w:b w:val="0"/>
+                <w:color w:val="000000"/>
+                <w:sz w:val="16"/>
+              </w:rPr>
+              <w:t>2. Cotas por faixa: 27 de 62 municípios (20 a 70 mil hab.), 100 de 205 (5 a 20 mil) e 30 de 102 (até 5 mil)</w:t>
+            </w:r>
+          </w:p>
+        </w:tc>
+      </w:tr>
+      <w:tr>
+        <w:trPr>
+          <w:cantSplit/>
+        </w:trPr>
+        <w:tc>
+          <w:tcPr>
+            <w:tcW w:type="dxa" w:w="2948"/>
+            <w:shd w:val="clear" w:color="auto" w:fill="FFFFFF"/>
+            <w:tcBorders>
+              <w:top w:val="single" w:sz="8" w:color="307E3E"/>
+              <w:left w:val="single" w:sz="8" w:color="307E3E"/>
+              <w:bottom w:val="single" w:sz="8" w:color="307E3E"/>
+              <w:right w:val="single" w:sz="8" w:color="307E3E"/>
+            </w:tcBorders>
+            <w:vAlign w:val="center"/>
+            <w:tcMar>
+              <w:top w:w="30" w:type="dxa"/>
+              <w:bottom w:w="30" w:type="dxa"/>
+              <w:left w:w="50" w:type="dxa"/>
+              <w:right w:w="50" w:type="dxa"/>
+            </w:tcMar>
+          </w:tcPr>
+          <w:p>
+            <w:pPr>
+              <w:spacing w:after="0" w:before="0" w:line="240" w:lineRule="auto"/>
+              <w:ind w:firstLine="0" w:left="0"/>
+              <w:jc w:val="center"/>
+            </w:pPr>
+            <w:r>
+              <w:rPr>
+                <w:rFonts w:ascii="Arial" w:hAnsi="Arial"/>
+                <w:b w:val="0"/>
+                <w:color w:val="000000"/>
+                <w:sz w:val="16"/>
+              </w:rPr>
+              <w:t>Descontada no cálculo dos blocos 2 e 3</w:t>
+            </w:r>
+          </w:p>
+        </w:tc>
+        <w:tc>
+          <w:tcPr>
+            <w:tcW w:type="dxa" w:w="113"/>
+            <w:shd w:val="clear" w:color="auto" w:fill="FFFFFF"/>
+            <w:tcBorders>
+              <w:top w:val="nil" w:sz="8" w:color="FFFFFF"/>
+              <w:left w:val="nil" w:sz="8" w:color="FFFFFF"/>
+              <w:bottom w:val="nil" w:sz="8" w:color="FFFFFF"/>
+              <w:right w:val="nil" w:sz="8" w:color="FFFFFF"/>
+            </w:tcBorders>
+            <w:vAlign w:val="center"/>
+            <w:tcMar>
+              <w:top w:w="30" w:type="dxa"/>
+              <w:bottom w:w="30" w:type="dxa"/>
+              <w:left w:w="50" w:type="dxa"/>
+              <w:right w:w="50" w:type="dxa"/>
+            </w:tcMar>
+          </w:tcPr>
+          <w:p/>
+        </w:tc>
+        <w:tc>
+          <w:tcPr>
+            <w:tcW w:type="dxa" w:w="2948"/>
+            <w:shd w:val="clear" w:color="auto" w:fill="FFFFFF"/>
+            <w:tcBorders>
+              <w:top w:val="single" w:sz="8" w:color="54278F"/>
+              <w:left w:val="single" w:sz="8" w:color="54278F"/>
+              <w:bottom w:val="single" w:sz="8" w:color="54278F"/>
+              <w:right w:val="single" w:sz="8" w:color="54278F"/>
+            </w:tcBorders>
+            <w:vAlign w:val="center"/>
+            <w:tcMar>
+              <w:top w:w="30" w:type="dxa"/>
+              <w:bottom w:w="30" w:type="dxa"/>
+              <w:left w:w="50" w:type="dxa"/>
+              <w:right w:w="50" w:type="dxa"/>
+            </w:tcMar>
+          </w:tcPr>
+          <w:p>
+            <w:pPr>
+              <w:spacing w:after="0" w:before="0" w:line="240" w:lineRule="auto"/>
+              <w:ind w:firstLine="0" w:left="0"/>
+              <w:jc w:val="center"/>
+            </w:pPr>
+            <w:r>
+              <w:rPr>
+                <w:rFonts w:ascii="Arial" w:hAnsi="Arial"/>
+                <w:b w:val="0"/>
+                <w:color w:val="000000"/>
+                <w:sz w:val="16"/>
+              </w:rPr>
+              <w:t>3. Arredondamento: parte inteira e, depois, maior resto</w:t>
+            </w:r>
+          </w:p>
+        </w:tc>
+        <w:tc>
+          <w:tcPr>
+            <w:tcW w:type="dxa" w:w="113"/>
+            <w:shd w:val="clear" w:color="auto" w:fill="FFFFFF"/>
+            <w:tcBorders>
+              <w:top w:val="nil" w:sz="8" w:color="FFFFFF"/>
+              <w:left w:val="nil" w:sz="8" w:color="FFFFFF"/>
+              <w:bottom w:val="nil" w:sz="8" w:color="FFFFFF"/>
+              <w:right w:val="nil" w:sz="8" w:color="FFFFFF"/>
+            </w:tcBorders>
+            <w:vAlign w:val="center"/>
+            <w:tcMar>
+              <w:top w:w="30" w:type="dxa"/>
+              <w:bottom w:w="30" w:type="dxa"/>
+              <w:left w:w="50" w:type="dxa"/>
+              <w:right w:w="50" w:type="dxa"/>
+            </w:tcMar>
+          </w:tcPr>
+          <w:p/>
+        </w:tc>
+        <w:tc>
+          <w:tcPr>
+            <w:tcW w:type="dxa" w:w="2948"/>
+            <w:shd w:val="clear" w:color="auto" w:fill="FFFFFF"/>
+            <w:tcBorders>
+              <w:top w:val="single" w:sz="8" w:color="595959"/>
+              <w:left w:val="single" w:sz="8" w:color="595959"/>
+              <w:bottom w:val="single" w:sz="8" w:color="595959"/>
+              <w:right w:val="single" w:sz="8" w:color="595959"/>
+            </w:tcBorders>
+            <w:vAlign w:val="center"/>
+            <w:tcMar>
+              <w:top w:w="30" w:type="dxa"/>
+              <w:bottom w:w="30" w:type="dxa"/>
+              <w:left w:w="50" w:type="dxa"/>
+              <w:right w:w="50" w:type="dxa"/>
+            </w:tcMar>
+          </w:tcPr>
+          <w:p>
+            <w:pPr>
+              <w:spacing w:after="0" w:before="0" w:line="240" w:lineRule="auto"/>
+              <w:ind w:firstLine="0" w:left="0"/>
+              <w:jc w:val="center"/>
+            </w:pPr>
+            <w:r>
+              <w:rPr>
+                <w:rFonts w:ascii="Arial" w:hAnsi="Arial"/>
+                <w:b w:val="0"/>
+                <w:color w:val="000000"/>
+                <w:sz w:val="16"/>
+              </w:rPr>
+              <w:t>3. Uma unidade por município contemplado; os demais ficam como suplentes, na ordem do índice</w:t>
+            </w:r>
+          </w:p>
+        </w:tc>
+      </w:tr>
+      <w:tr>
+        <w:trPr>
+          <w:cantSplit/>
+        </w:trPr>
+        <w:tc>
+          <w:tcPr>
+            <w:tcW w:type="dxa" w:w="2948"/>
+            <w:shd w:val="clear" w:color="auto" w:fill="FFFFFF"/>
+            <w:tcBorders>
+              <w:top w:val="nil" w:sz="8" w:color="FFFFFF"/>
+              <w:left w:val="nil" w:sz="8" w:color="FFFFFF"/>
+              <w:bottom w:val="nil" w:sz="8" w:color="FFFFFF"/>
+              <w:right w:val="nil" w:sz="8" w:color="FFFFFF"/>
+            </w:tcBorders>
+            <w:vAlign w:val="center"/>
+            <w:tcMar>
+              <w:top w:w="30" w:type="dxa"/>
+              <w:bottom w:w="30" w:type="dxa"/>
+              <w:left w:w="50" w:type="dxa"/>
+              <w:right w:w="50" w:type="dxa"/>
+            </w:tcMar>
+          </w:tcPr>
+          <w:p/>
+        </w:tc>
+        <w:tc>
+          <w:tcPr>
+            <w:tcW w:type="dxa" w:w="113"/>
+            <w:shd w:val="clear" w:color="auto" w:fill="FFFFFF"/>
+            <w:tcBorders>
+              <w:top w:val="nil" w:sz="8" w:color="FFFFFF"/>
+              <w:left w:val="nil" w:sz="8" w:color="FFFFFF"/>
+              <w:bottom w:val="nil" w:sz="8" w:color="FFFFFF"/>
+              <w:right w:val="nil" w:sz="8" w:color="FFFFFF"/>
+            </w:tcBorders>
+            <w:vAlign w:val="center"/>
+            <w:tcMar>
+              <w:top w:w="30" w:type="dxa"/>
+              <w:bottom w:w="30" w:type="dxa"/>
+              <w:left w:w="50" w:type="dxa"/>
+              <w:right w:w="50" w:type="dxa"/>
+            </w:tcMar>
+          </w:tcPr>
+          <w:p/>
+        </w:tc>
+        <w:tc>
+          <w:tcPr>
+            <w:tcW w:type="dxa" w:w="2948"/>
+            <w:shd w:val="clear" w:color="auto" w:fill="FFFFFF"/>
+            <w:tcBorders>
+              <w:top w:val="single" w:sz="8" w:color="54278F"/>
+              <w:left w:val="single" w:sz="8" w:color="54278F"/>
+              <w:bottom w:val="single" w:sz="8" w:color="54278F"/>
+              <w:right w:val="single" w:sz="8" w:color="54278F"/>
+            </w:tcBorders>
+            <w:vAlign w:val="center"/>
+            <w:tcMar>
+              <w:top w:w="30" w:type="dxa"/>
+              <w:bottom w:w="30" w:type="dxa"/>
+              <w:left w:w="50" w:type="dxa"/>
+              <w:right w:w="50" w:type="dxa"/>
+            </w:tcMar>
+          </w:tcPr>
+          <w:p>
+            <w:pPr>
+              <w:spacing w:after="0" w:before="0" w:line="240" w:lineRule="auto"/>
+              <w:ind w:firstLine="0" w:left="0"/>
+              <w:jc w:val="center"/>
+            </w:pPr>
+            <w:r>
+              <w:rPr>
+                <w:rFonts w:ascii="Arial" w:hAnsi="Arial"/>
+                <w:b w:val="0"/>
+                <w:color w:val="000000"/>
+                <w:sz w:val="16"/>
+              </w:rPr>
+              <w:t>4. Tetos por município: 10, 8, 7, 4 e 2 unidades (de 142 para 100)</w:t>
+            </w:r>
+          </w:p>
+        </w:tc>
+        <w:tc>
+          <w:tcPr>
+            <w:tcW w:type="dxa" w:w="113"/>
+            <w:shd w:val="clear" w:color="auto" w:fill="FFFFFF"/>
+            <w:tcBorders>
+              <w:top w:val="nil" w:sz="8" w:color="FFFFFF"/>
+              <w:left w:val="nil" w:sz="8" w:color="FFFFFF"/>
+              <w:bottom w:val="nil" w:sz="8" w:color="FFFFFF"/>
+              <w:right w:val="nil" w:sz="8" w:color="FFFFFF"/>
+            </w:tcBorders>
+            <w:vAlign w:val="center"/>
+            <w:tcMar>
+              <w:top w:w="30" w:type="dxa"/>
+              <w:bottom w:w="30" w:type="dxa"/>
+              <w:left w:w="50" w:type="dxa"/>
+              <w:right w:w="50" w:type="dxa"/>
+            </w:tcMar>
+          </w:tcPr>
+          <w:p/>
+        </w:tc>
+        <w:tc>
+          <w:tcPr>
+            <w:tcW w:type="dxa" w:w="2948"/>
+            <w:shd w:val="clear" w:color="auto" w:fill="FFFFFF"/>
+            <w:tcBorders>
+              <w:top w:val="nil" w:sz="8" w:color="FFFFFF"/>
+              <w:left w:val="nil" w:sz="8" w:color="FFFFFF"/>
+              <w:bottom w:val="nil" w:sz="8" w:color="FFFFFF"/>
+              <w:right w:val="nil" w:sz="8" w:color="FFFFFF"/>
+            </w:tcBorders>
+            <w:vAlign w:val="center"/>
+            <w:tcMar>
+              <w:top w:w="30" w:type="dxa"/>
+              <w:bottom w:w="30" w:type="dxa"/>
+              <w:left w:w="50" w:type="dxa"/>
+              <w:right w:w="50" w:type="dxa"/>
+            </w:tcMar>
+          </w:tcPr>
+          <w:p/>
+        </w:tc>
+      </w:tr>
+      <w:tr>
+        <w:trPr>
+          <w:cantSplit/>
+        </w:trPr>
+        <w:tc>
+          <w:tcPr>
+            <w:tcW w:type="dxa" w:w="9072"/>
+            <w:gridSpan w:val="5"/>
+            <w:shd w:val="clear" w:color="auto" w:fill="E6E6E6"/>
+            <w:tcBorders>
+              <w:top w:val="single" w:sz="8" w:color="7F7F7F"/>
+              <w:left w:val="single" w:sz="8" w:color="7F7F7F"/>
+              <w:bottom w:val="single" w:sz="8" w:color="7F7F7F"/>
+              <w:right w:val="single" w:sz="8" w:color="7F7F7F"/>
+            </w:tcBorders>
+            <w:vAlign w:val="center"/>
+            <w:tcMar>
+              <w:top w:w="30" w:type="dxa"/>
+              <w:bottom w:w="30" w:type="dxa"/>
+              <w:left w:w="50" w:type="dxa"/>
+              <w:right w:w="50" w:type="dxa"/>
+            </w:tcMar>
+          </w:tcPr>
+          <w:p>
+            <w:pPr>
+              <w:spacing w:after="0" w:before="0" w:line="240" w:lineRule="auto"/>
+              <w:ind w:firstLine="0" w:left="0"/>
+              <w:jc w:val="center"/>
+            </w:pPr>
+            <w:r>
+              <w:rPr>
+                <w:rFonts w:ascii="Arial" w:hAnsi="Arial"/>
+                <w:b/>
+                <w:color w:val="000000"/>
+                <w:sz w:val="16"/>
+              </w:rPr>
+              <w:t>Resultado: 43 + 100 + 157 = 300 unidades em 224 municípios (março de 2024). Tetos menores em maio de 2024: 300 unidades em 258 municípios. Resolução SEDEF 219/2024: 303 unidades em 261 municípios</w:t>
+            </w:r>
+          </w:p>
+        </w:tc>
+      </w:tr>
+    </w:tbl>
+    <w:p>
+      <w:pPr>
+        <w:keepNext w:val="0"/>
+        <w:spacing w:line="240" w:lineRule="auto" w:after="120" w:before="60"/>
+        <w:ind w:firstLine="0"/>
+        <w:jc w:val="left"/>
+      </w:pPr>
+      <w:r>
+        <w:rPr>
+          <w:rFonts w:ascii="Arial" w:hAnsi="Arial"/>
+          <w:b w:val="0"/>
+          <w:i w:val="0"/>
+          <w:sz w:val="20"/>
+        </w:rPr>
+        <w:t>Fonte: Elaboração própria a partir das planilhas do estudo (abas Metodologia e Dados), de CEDCA (2023) e de Paraná (2024a).</w:t>
+      </w:r>
+    </w:p>
+    <w:p>
+      <w:pPr>
+        <w:keepNext w:val="0"/>
+        <w:spacing w:line="360" w:lineRule="auto" w:after="0" w:before="0"/>
+        <w:ind w:firstLine="850"/>
+        <w:jc w:val="both"/>
+      </w:pPr>
+      <w:r>
+        <w:rPr>
+          <w:rFonts w:ascii="Arial" w:hAnsi="Arial"/>
+          <w:b w:val="0"/>
+          <w:i w:val="0"/>
+          <w:sz w:val="24"/>
+        </w:rPr>
+        <w:t>A etapa prévia antecedeu o índice. A Deliberação nº 60/2023 do CEDCA/PR aprovou R$ 70,95 milhões do Fundo Estadual para a Infância e Adolescência para 43 creches, uma em cada um de 43 municípios selecionados por um índice de prioridade do Ipardes, construído a partir do déficit de vagas, do crescimento da população de zero a três anos e do número de crianças com perfil do Bolsa Família (CEDCA, 2023). Por isso, a regra descrita a seguir distribui as 257 unidades restantes e desconta, em cada município, a unidade já recebida.</w:t>
+      </w:r>
+    </w:p>
+    <w:p>
+      <w:pPr>
+        <w:keepNext w:val="0"/>
+        <w:spacing w:line="360" w:lineRule="auto" w:after="0" w:before="0"/>
+        <w:ind w:firstLine="850"/>
+        <w:jc w:val="both"/>
+      </w:pPr>
+      <w:r>
+        <w:rPr>
+          <w:rFonts w:ascii="Arial" w:hAnsi="Arial"/>
+          <w:b w:val="0"/>
+          <w:i w:val="0"/>
+          <w:sz w:val="24"/>
+        </w:rPr>
+        <w:t>Nos municípios grandes, o cálculo parte de uma cota por faixa de porte, proporcional à parcela da faixa na população-alvo do estado. O total a repartir é reduzido pelo fator 1 + m, em que m é o PCM médio ponderado pela população-alvo (0,503), porque no passo seguinte a cota de cada município é ampliada pelo seu próprio PCM; sem a redução, a soma ultrapassaria o total disponível:</w:t>
       </w:r>
     </w:p>
     <w:p>
@@ -9965,13 +10883,19 @@
             </m:r>
           </m:sub>
         </m:sSub>
+        <m:r>
+          <w:rPr>
+            <w:rFonts w:ascii="Cambria Math" w:hAnsi="Cambria Math"/>
+          </w:rPr>
+          <m:t xml:space="preserve"> = </m:t>
+        </m:r>
         <m:sSub>
           <m:e>
             <m:r>
               <w:rPr>
                 <w:rFonts w:ascii="Cambria Math" w:hAnsi="Cambria Math"/>
               </w:rPr>
-              <m:t xml:space="preserve"> = s</m:t>
+              <m:t xml:space="preserve">s</m:t>
             </m:r>
           </m:e>
           <m:sub>
@@ -10003,7 +10927,7 @@
         </m:r>
         <m:f>
           <m:num>
-            <m:sSup>
+            <m:sSub>
               <m:e>
                 <m:r>
                   <w:rPr>
@@ -10012,15 +10936,15 @@
                   <m:t xml:space="preserve">N</m:t>
                 </m:r>
               </m:e>
-              <m:sup>
+              <m:sub>
                 <m:r>
                   <w:rPr>
                     <w:rFonts w:ascii="Cambria Math" w:hAnsi="Cambria Math"/>
                   </w:rPr>
-                  <m:t xml:space="preserve">*</m:t>
+                  <m:t xml:space="preserve">r</m:t>
                 </m:r>
-              </m:sup>
-            </m:sSup>
+              </m:sub>
+            </m:sSub>
           </m:num>
           <m:den>
             <m:r>
@@ -10055,7 +10979,91 @@
           <w:i w:val="0"/>
           <w:sz w:val="24"/>
         </w:rPr>
-        <w:t>A cota do porte é repartida entre seus municípios na proporção da população-alvo, e o índice entra como multiplicador, descontadas as unidades E_i da etapa prévia:</w:t>
+        <w:t xml:space="preserve">em que </w:t>
+      </w:r>
+      <w:r>
+        <w:rPr>
+          <w:rFonts w:ascii="Arial" w:hAnsi="Arial"/>
+          <w:b w:val="0"/>
+          <w:i/>
+          <w:sz w:val="24"/>
+        </w:rPr>
+        <w:t>C</w:t>
+      </w:r>
+      <w:r>
+        <w:rPr>
+          <w:rFonts w:ascii="Arial" w:hAnsi="Arial"/>
+          <w:b w:val="0"/>
+          <w:i/>
+          <w:sz w:val="24"/>
+          <w:vertAlign w:val="subscript"/>
+        </w:rPr>
+        <w:t>p</w:t>
+      </w:r>
+      <w:r>
+        <w:rPr>
+          <w:rFonts w:ascii="Arial" w:hAnsi="Arial"/>
+          <w:b w:val="0"/>
+          <w:i w:val="0"/>
+          <w:sz w:val="24"/>
+        </w:rPr>
+        <w:t xml:space="preserve"> é a cota da faixa p, </w:t>
+      </w:r>
+      <w:r>
+        <w:rPr>
+          <w:rFonts w:ascii="Arial" w:hAnsi="Arial"/>
+          <w:b w:val="0"/>
+          <w:i/>
+          <w:sz w:val="24"/>
+        </w:rPr>
+        <w:t>s</w:t>
+      </w:r>
+      <w:r>
+        <w:rPr>
+          <w:rFonts w:ascii="Arial" w:hAnsi="Arial"/>
+          <w:b w:val="0"/>
+          <w:i/>
+          <w:sz w:val="24"/>
+          <w:vertAlign w:val="subscript"/>
+        </w:rPr>
+        <w:t>p</w:t>
+      </w:r>
+      <w:r>
+        <w:rPr>
+          <w:rFonts w:ascii="Arial" w:hAnsi="Arial"/>
+          <w:b w:val="0"/>
+          <w:i w:val="0"/>
+          <w:sz w:val="24"/>
+        </w:rPr>
+        <w:t xml:space="preserve"> é a parcela da faixa na população-alvo e </w:t>
+      </w:r>
+      <w:r>
+        <w:rPr>
+          <w:rFonts w:ascii="Arial" w:hAnsi="Arial"/>
+          <w:b w:val="0"/>
+          <w:i/>
+          <w:sz w:val="24"/>
+        </w:rPr>
+        <w:t>N</w:t>
+      </w:r>
+      <w:r>
+        <w:rPr>
+          <w:rFonts w:ascii="Arial" w:hAnsi="Arial"/>
+          <w:b w:val="0"/>
+          <w:i/>
+          <w:sz w:val="24"/>
+          <w:vertAlign w:val="subscript"/>
+        </w:rPr>
+        <w:t>r</w:t>
+      </w:r>
+      <w:r>
+        <w:rPr>
+          <w:rFonts w:ascii="Arial" w:hAnsi="Arial"/>
+          <w:b w:val="0"/>
+          <w:i w:val="0"/>
+          <w:sz w:val="24"/>
+        </w:rPr>
+        <w:t xml:space="preserve"> = 257 é o número de unidades restantes após a etapa prévia. A cota da faixa é então repartida entre seus municípios na proporção da população-alvo, e o índice entra como multiplicador:</w:t>
       </w:r>
     </w:p>
     <w:p>
@@ -10155,13 +11163,19 @@
           </w:rPr>
           <m:t xml:space="preserve">·</m:t>
         </m:r>
+        <m:r>
+          <w:rPr>
+            <w:rFonts w:ascii="Cambria Math" w:hAnsi="Cambria Math"/>
+          </w:rPr>
+          <m:t xml:space="preserve"> </m:t>
+        </m:r>
         <m:sSub>
           <m:e>
             <m:r>
               <w:rPr>
                 <w:rFonts w:ascii="Cambria Math" w:hAnsi="Cambria Math"/>
               </w:rPr>
-              <m:t xml:space="preserve"> C</m:t>
+              <m:t xml:space="preserve">C</m:t>
             </m:r>
           </m:e>
           <m:sub>
@@ -10197,13 +11211,19 @@
             <m:endChr m:val=")"/>
           </m:dPr>
           <m:e>
+            <m:r>
+              <w:rPr>
+                <w:rFonts w:ascii="Cambria Math" w:hAnsi="Cambria Math"/>
+              </w:rPr>
+              <m:t xml:space="preserve">1 + </m:t>
+            </m:r>
             <m:sSub>
               <m:e>
                 <m:r>
                   <w:rPr>
                     <w:rFonts w:ascii="Cambria Math" w:hAnsi="Cambria Math"/>
                   </w:rPr>
-                  <m:t xml:space="preserve">1 + PCM</m:t>
+                  <m:t xml:space="preserve">PCM</m:t>
                 </m:r>
               </m:e>
               <m:sub>
@@ -10217,13 +11237,19 @@
             </m:sSub>
           </m:e>
         </m:d>
+        <m:r>
+          <w:rPr>
+            <w:rFonts w:ascii="Cambria Math" w:hAnsi="Cambria Math"/>
+          </w:rPr>
+          <m:t xml:space="preserve"> - </m:t>
+        </m:r>
         <m:sSub>
           <m:e>
             <m:r>
               <w:rPr>
                 <w:rFonts w:ascii="Cambria Math" w:hAnsi="Cambria Math"/>
               </w:rPr>
-              <m:t xml:space="preserve"> - E</m:t>
+              <m:t xml:space="preserve">E</m:t>
             </m:r>
           </m:e>
           <m:sub>
@@ -10259,873 +11285,198 @@
           <w:i w:val="0"/>
           <w:sz w:val="24"/>
         </w:rPr>
-        <w:t>em que a_i é a população-alvo do município i e A_p a do porte a que pertence. Um município com PCM de 0,50 recebe 50% a mais que sua cota populacional. O arredondamento segue o método do maior resto, tal como implementado na planilha: a parte inteira de K_i é atribuída de imediato (90 unidades) e as 111 restantes vão aos municípios com as maiores frações, uma por município. Sobre esse cálculo incidem os limites por faixa: tetos por município de 10, 8, 7, 4 e 2 unidades nos portes grandes, que reduziram o resultado proporcional de 142 para 100 unidades, e cotas de 27, 100 e 30 municípios nos portes pequenos, contemplados por ordem decrescente de PCM, excluídos os da etapa prévia. A escolha do maior resto, que respeita a cota ao custo de paradoxos de monotonicidade, é a usual em problemas de repartição de unidades indivisíveis (BALINSKI; YOUNG, 2001).</w:t>
+        <w:t xml:space="preserve">em que </w:t>
+      </w:r>
+      <w:r>
+        <w:rPr>
+          <w:rFonts w:ascii="Arial" w:hAnsi="Arial"/>
+          <w:b w:val="0"/>
+          <w:i/>
+          <w:sz w:val="24"/>
+        </w:rPr>
+        <w:t>K</w:t>
+      </w:r>
+      <w:r>
+        <w:rPr>
+          <w:rFonts w:ascii="Arial" w:hAnsi="Arial"/>
+          <w:b w:val="0"/>
+          <w:i/>
+          <w:sz w:val="24"/>
+          <w:vertAlign w:val="subscript"/>
+        </w:rPr>
+        <w:t>i</w:t>
+      </w:r>
+      <w:r>
+        <w:rPr>
+          <w:rFonts w:ascii="Arial" w:hAnsi="Arial"/>
+          <w:b w:val="0"/>
+          <w:i w:val="0"/>
+          <w:sz w:val="24"/>
+        </w:rPr>
+        <w:t xml:space="preserve"> é o número de unidades do município i, </w:t>
+      </w:r>
+      <w:r>
+        <w:rPr>
+          <w:rFonts w:ascii="Arial" w:hAnsi="Arial"/>
+          <w:b w:val="0"/>
+          <w:i/>
+          <w:sz w:val="24"/>
+        </w:rPr>
+        <w:t>a</w:t>
+      </w:r>
+      <w:r>
+        <w:rPr>
+          <w:rFonts w:ascii="Arial" w:hAnsi="Arial"/>
+          <w:b w:val="0"/>
+          <w:i/>
+          <w:sz w:val="24"/>
+          <w:vertAlign w:val="subscript"/>
+        </w:rPr>
+        <w:t>i</w:t>
+      </w:r>
+      <w:r>
+        <w:rPr>
+          <w:rFonts w:ascii="Arial" w:hAnsi="Arial"/>
+          <w:b w:val="0"/>
+          <w:i w:val="0"/>
+          <w:sz w:val="24"/>
+        </w:rPr>
+        <w:t xml:space="preserve"> é sua população-alvo, </w:t>
+      </w:r>
+      <w:r>
+        <w:rPr>
+          <w:rFonts w:ascii="Arial" w:hAnsi="Arial"/>
+          <w:b w:val="0"/>
+          <w:i/>
+          <w:sz w:val="24"/>
+        </w:rPr>
+        <w:t>A</w:t>
+      </w:r>
+      <w:r>
+        <w:rPr>
+          <w:rFonts w:ascii="Arial" w:hAnsi="Arial"/>
+          <w:b w:val="0"/>
+          <w:i/>
+          <w:sz w:val="24"/>
+          <w:vertAlign w:val="subscript"/>
+        </w:rPr>
+        <w:t>p</w:t>
+      </w:r>
+      <w:r>
+        <w:rPr>
+          <w:rFonts w:ascii="Arial" w:hAnsi="Arial"/>
+          <w:b w:val="0"/>
+          <w:i w:val="0"/>
+          <w:sz w:val="24"/>
+        </w:rPr>
+        <w:t xml:space="preserve"> é a população-alvo da faixa e </w:t>
+      </w:r>
+      <w:r>
+        <w:rPr>
+          <w:rFonts w:ascii="Arial" w:hAnsi="Arial"/>
+          <w:b w:val="0"/>
+          <w:i/>
+          <w:sz w:val="24"/>
+        </w:rPr>
+        <w:t>E</w:t>
+      </w:r>
+      <w:r>
+        <w:rPr>
+          <w:rFonts w:ascii="Arial" w:hAnsi="Arial"/>
+          <w:b w:val="0"/>
+          <w:i/>
+          <w:sz w:val="24"/>
+          <w:vertAlign w:val="subscript"/>
+        </w:rPr>
+        <w:t>i</w:t>
+      </w:r>
+      <w:r>
+        <w:rPr>
+          <w:rFonts w:ascii="Arial" w:hAnsi="Arial"/>
+          <w:b w:val="0"/>
+          <w:i w:val="0"/>
+          <w:sz w:val="24"/>
+        </w:rPr>
+        <w:t xml:space="preserve"> é a unidade eventualmente recebida na etapa prévia. Um município com PCM de 0,50 recebe 50% a mais do que receberia pela população. Curitiba ilustra o cálculo: a cota de sua faixa, que ocupa sozinha, é de 23,1 unidades; multiplicada por 1 + 0,286, seu PCM, chega a 29,7.</w:t>
       </w:r>
     </w:p>
     <w:p>
       <w:pPr>
-        <w:keepNext/>
-        <w:spacing w:line="240" w:lineRule="auto" w:after="60" w:before="160"/>
-        <w:ind w:firstLine="0"/>
-        <w:jc w:val="left"/>
+        <w:keepNext w:val="0"/>
+        <w:spacing w:line="360" w:lineRule="auto" w:after="0" w:before="0"/>
+        <w:ind w:firstLine="850"/>
+        <w:jc w:val="both"/>
       </w:pPr>
       <w:r>
         <w:rPr>
           <w:rFonts w:ascii="Arial" w:hAnsi="Arial"/>
           <w:b w:val="0"/>
           <w:i w:val="0"/>
-          <w:sz w:val="22"/>
+          <w:sz w:val="24"/>
         </w:rPr>
-        <w:t>Figura 5. Da cota populacional às unidades inteiras: regra aplicada na versão de maio de 2024</w:t>
+        <w:t xml:space="preserve">Como </w:t>
+      </w:r>
+      <w:r>
+        <w:rPr>
+          <w:rFonts w:ascii="Arial" w:hAnsi="Arial"/>
+          <w:b w:val="0"/>
+          <w:i/>
+          <w:sz w:val="24"/>
+        </w:rPr>
+        <w:t>K</w:t>
+      </w:r>
+      <w:r>
+        <w:rPr>
+          <w:rFonts w:ascii="Arial" w:hAnsi="Arial"/>
+          <w:b w:val="0"/>
+          <w:i/>
+          <w:sz w:val="24"/>
+          <w:vertAlign w:val="subscript"/>
+        </w:rPr>
+        <w:t>i</w:t>
+      </w:r>
+      <w:r>
+        <w:rPr>
+          <w:rFonts w:ascii="Arial" w:hAnsi="Arial"/>
+          <w:b w:val="0"/>
+          <w:i w:val="0"/>
+          <w:sz w:val="24"/>
+        </w:rPr>
+        <w:t xml:space="preserve"> é fracionário, a conversão em unidades inteiras segue o método do maior resto, como implementado na planilha: a parte inteira é atribuída de imediato e as unidades restantes vão, uma a uma, aos municípios com as maiores frações (BALINSKI; YOUNG, 2001). Curitiba passa de 29,7 a 30 unidades. Sobre esse resultado incidem os tetos por município, de 10, 8, 7, 4 e 2 unidades nas cinco faixas, em ordem decrescente de porte, que reduziram o total dos 30 municípios grandes de 142 para 100 unidades e o de Curitiba, de 30 para 10.</w:t>
       </w:r>
     </w:p>
-    <w:tbl>
-      <w:tblPr>
-        <w:tblW w:type="auto" w:w="0"/>
-        <w:jc w:val="center"/>
-        <w:tblLayout w:type="fixed"/>
-        <w:tblLook w:firstColumn="1" w:firstRow="1" w:lastColumn="0" w:lastRow="0" w:noHBand="0" w:noVBand="1" w:val="04A0"/>
-        <w:tblLayout w:type="fixed"/>
-        <w:tblW w:w="9072" w:type="dxa"/>
-      </w:tblPr>
-      <w:tblGrid>
-        <w:gridCol w:w="4309"/>
-        <w:gridCol w:w="453"/>
-        <w:gridCol w:w="4309"/>
-      </w:tblGrid>
-      <w:tr>
-        <w:trPr>
-          <w:cantSplit/>
-        </w:trPr>
-        <w:tc>
-          <w:tcPr>
-            <w:tcW w:type="dxa" w:w="9072"/>
-            <w:gridSpan w:val="3"/>
-            <w:shd w:val="clear" w:color="auto" w:fill="E6E6E6"/>
-            <w:tcBorders>
-              <w:top w:val="single" w:sz="8" w:color="7F7F7F"/>
-              <w:left w:val="single" w:sz="8" w:color="7F7F7F"/>
-              <w:bottom w:val="single" w:sz="8" w:color="7F7F7F"/>
-              <w:right w:val="single" w:sz="8" w:color="7F7F7F"/>
-            </w:tcBorders>
-            <w:vAlign w:val="center"/>
-            <w:tcMar>
-              <w:top w:w="30" w:type="dxa"/>
-              <w:bottom w:w="30" w:type="dxa"/>
-              <w:left w:w="50" w:type="dxa"/>
-              <w:right w:w="50" w:type="dxa"/>
-            </w:tcMar>
-          </w:tcPr>
-          <w:p>
-            <w:pPr>
-              <w:spacing w:after="0" w:before="0" w:line="240" w:lineRule="auto"/>
-              <w:ind w:firstLine="0" w:left="0"/>
-              <w:jc w:val="center"/>
-            </w:pPr>
-            <w:r>
-              <w:rPr>
-                <w:rFonts w:ascii="Arial" w:hAnsi="Arial"/>
-                <w:b w:val="0"/>
-                <w:color w:val="000000"/>
-                <w:sz w:val="16"/>
-              </w:rPr>
-              <w:t>Parâmetros: 257 unidades a distribuir (300 menos 43 da etapa prévia), oito portes, população-alvo por porte, PCM por município, tetos e cotas por faixa</w:t>
-            </w:r>
-          </w:p>
-        </w:tc>
-      </w:tr>
-      <w:tr>
-        <w:trPr>
-          <w:cantSplit/>
-        </w:trPr>
-        <w:tc>
-          <w:tcPr>
-            <w:tcW w:type="dxa" w:w="4309"/>
-            <w:shd w:val="clear" w:color="auto" w:fill="FFFFFF"/>
-            <w:tcBorders>
-              <w:top w:val="nil" w:sz="8" w:color="FFFFFF"/>
-              <w:left w:val="nil" w:sz="8" w:color="FFFFFF"/>
-              <w:bottom w:val="nil" w:sz="8" w:color="FFFFFF"/>
-              <w:right w:val="nil" w:sz="8" w:color="FFFFFF"/>
-            </w:tcBorders>
-            <w:vAlign w:val="center"/>
-            <w:tcMar>
-              <w:top w:w="30" w:type="dxa"/>
-              <w:bottom w:w="30" w:type="dxa"/>
-              <w:left w:w="50" w:type="dxa"/>
-              <w:right w:w="50" w:type="dxa"/>
-            </w:tcMar>
-          </w:tcPr>
-          <w:p/>
-        </w:tc>
-        <w:tc>
-          <w:tcPr>
-            <w:tcW w:type="dxa" w:w="453"/>
-            <w:shd w:val="clear" w:color="auto" w:fill="FFFFFF"/>
-            <w:tcBorders>
-              <w:top w:val="nil" w:sz="8" w:color="FFFFFF"/>
-              <w:left w:val="nil" w:sz="8" w:color="FFFFFF"/>
-              <w:bottom w:val="nil" w:sz="8" w:color="FFFFFF"/>
-              <w:right w:val="nil" w:sz="8" w:color="FFFFFF"/>
-            </w:tcBorders>
-            <w:vAlign w:val="center"/>
-            <w:tcMar>
-              <w:top w:w="30" w:type="dxa"/>
-              <w:bottom w:w="30" w:type="dxa"/>
-              <w:left w:w="50" w:type="dxa"/>
-              <w:right w:w="50" w:type="dxa"/>
-            </w:tcMar>
-          </w:tcPr>
-          <w:p>
-            <w:pPr>
-              <w:ind w:firstLine="0" w:left="0"/>
-              <w:jc w:val="center"/>
-            </w:pPr>
-            <w:r>
-              <w:rPr>
-                <w:rFonts w:ascii="Arial" w:hAnsi="Arial"/>
-                <w:sz w:val="20"/>
-              </w:rPr>
-              <w:t>↓</w:t>
-            </w:r>
-          </w:p>
-        </w:tc>
-        <w:tc>
-          <w:tcPr>
-            <w:tcW w:type="dxa" w:w="4309"/>
-            <w:shd w:val="clear" w:color="auto" w:fill="FFFFFF"/>
-            <w:tcBorders>
-              <w:top w:val="nil" w:sz="8" w:color="FFFFFF"/>
-              <w:left w:val="nil" w:sz="8" w:color="FFFFFF"/>
-              <w:bottom w:val="nil" w:sz="8" w:color="FFFFFF"/>
-              <w:right w:val="nil" w:sz="8" w:color="FFFFFF"/>
-            </w:tcBorders>
-            <w:vAlign w:val="center"/>
-            <w:tcMar>
-              <w:top w:w="30" w:type="dxa"/>
-              <w:bottom w:w="30" w:type="dxa"/>
-              <w:left w:w="50" w:type="dxa"/>
-              <w:right w:w="50" w:type="dxa"/>
-            </w:tcMar>
-          </w:tcPr>
-          <w:p/>
-        </w:tc>
-      </w:tr>
-      <w:tr>
-        <w:trPr>
-          <w:cantSplit/>
-        </w:trPr>
-        <w:tc>
-          <w:tcPr>
-            <w:tcW w:type="dxa" w:w="4309"/>
-            <w:shd w:val="clear" w:color="auto" w:fill="FFFFFF"/>
-            <w:tcBorders>
-              <w:top w:val="single" w:sz="8" w:color="595959"/>
-              <w:left w:val="single" w:sz="8" w:color="595959"/>
-              <w:bottom w:val="single" w:sz="8" w:color="595959"/>
-              <w:right w:val="single" w:sz="8" w:color="595959"/>
-            </w:tcBorders>
-            <w:vAlign w:val="center"/>
-            <w:tcMar>
-              <w:top w:w="30" w:type="dxa"/>
-              <w:bottom w:w="30" w:type="dxa"/>
-              <w:left w:w="50" w:type="dxa"/>
-              <w:right w:w="50" w:type="dxa"/>
-            </w:tcMar>
-          </w:tcPr>
-          <w:p>
-            <w:pPr>
-              <w:spacing w:after="0" w:before="0" w:line="240" w:lineRule="auto"/>
-              <w:ind w:firstLine="0" w:left="0"/>
-              <w:jc w:val="center"/>
-            </w:pPr>
-            <w:r>
-              <w:rPr>
-                <w:rFonts w:ascii="Arial" w:hAnsi="Arial"/>
-                <w:b w:val="0"/>
-                <w:color w:val="000000"/>
-                <w:sz w:val="16"/>
-              </w:rPr>
-              <w:t>1. Cota do porte: parcela na população-alvo × 257 / (1 + PCM médio ponderado)</w:t>
-            </w:r>
-          </w:p>
-        </w:tc>
-        <w:tc>
-          <w:tcPr>
-            <w:tcW w:type="dxa" w:w="453"/>
-            <w:shd w:val="clear" w:color="auto" w:fill="FFFFFF"/>
-            <w:tcBorders>
-              <w:top w:val="nil" w:sz="8" w:color="FFFFFF"/>
-              <w:left w:val="nil" w:sz="8" w:color="FFFFFF"/>
-              <w:bottom w:val="nil" w:sz="8" w:color="FFFFFF"/>
-              <w:right w:val="nil" w:sz="8" w:color="FFFFFF"/>
-            </w:tcBorders>
-            <w:vAlign w:val="center"/>
-            <w:tcMar>
-              <w:top w:w="30" w:type="dxa"/>
-              <w:bottom w:w="30" w:type="dxa"/>
-              <w:left w:w="50" w:type="dxa"/>
-              <w:right w:w="50" w:type="dxa"/>
-            </w:tcMar>
-          </w:tcPr>
-          <w:p>
-            <w:pPr>
-              <w:ind w:firstLine="0" w:left="0"/>
-              <w:jc w:val="center"/>
-            </w:pPr>
-            <w:r>
-              <w:rPr>
-                <w:rFonts w:ascii="Arial" w:hAnsi="Arial"/>
-                <w:sz w:val="20"/>
-              </w:rPr>
-              <w:t>→</w:t>
-            </w:r>
-          </w:p>
-        </w:tc>
-        <w:tc>
-          <w:tcPr>
-            <w:tcW w:type="dxa" w:w="4309"/>
-            <w:shd w:val="clear" w:color="auto" w:fill="FFFFFF"/>
-            <w:tcBorders>
-              <w:top w:val="single" w:sz="8" w:color="595959"/>
-              <w:left w:val="single" w:sz="8" w:color="595959"/>
-              <w:bottom w:val="single" w:sz="8" w:color="595959"/>
-              <w:right w:val="single" w:sz="8" w:color="595959"/>
-            </w:tcBorders>
-            <w:vAlign w:val="center"/>
-            <w:tcMar>
-              <w:top w:w="30" w:type="dxa"/>
-              <w:bottom w:w="30" w:type="dxa"/>
-              <w:left w:w="50" w:type="dxa"/>
-              <w:right w:w="50" w:type="dxa"/>
-            </w:tcMar>
-          </w:tcPr>
-          <w:p>
-            <w:pPr>
-              <w:spacing w:after="0" w:before="0" w:line="240" w:lineRule="auto"/>
-              <w:ind w:firstLine="0" w:left="0"/>
-              <w:jc w:val="center"/>
-            </w:pPr>
-            <w:r>
-              <w:rPr>
-                <w:rFonts w:ascii="Arial" w:hAnsi="Arial"/>
-                <w:b w:val="0"/>
-                <w:color w:val="000000"/>
-                <w:sz w:val="16"/>
-              </w:rPr>
-              <w:t>2. Cota do município: parcela do município na população-alvo do porte × cota do porte</w:t>
-            </w:r>
-          </w:p>
-        </w:tc>
-      </w:tr>
-      <w:tr>
-        <w:trPr>
-          <w:cantSplit/>
-        </w:trPr>
-        <w:tc>
-          <w:tcPr>
-            <w:tcW w:type="dxa" w:w="4309"/>
-            <w:shd w:val="clear" w:color="auto" w:fill="FFFFFF"/>
-            <w:tcBorders>
-              <w:top w:val="nil" w:sz="8" w:color="FFFFFF"/>
-              <w:left w:val="nil" w:sz="8" w:color="FFFFFF"/>
-              <w:bottom w:val="nil" w:sz="8" w:color="FFFFFF"/>
-              <w:right w:val="nil" w:sz="8" w:color="FFFFFF"/>
-            </w:tcBorders>
-            <w:vAlign w:val="center"/>
-            <w:tcMar>
-              <w:top w:w="30" w:type="dxa"/>
-              <w:bottom w:w="30" w:type="dxa"/>
-              <w:left w:w="50" w:type="dxa"/>
-              <w:right w:w="50" w:type="dxa"/>
-            </w:tcMar>
-          </w:tcPr>
-          <w:p/>
-        </w:tc>
-        <w:tc>
-          <w:tcPr>
-            <w:tcW w:type="dxa" w:w="453"/>
-            <w:shd w:val="clear" w:color="auto" w:fill="FFFFFF"/>
-            <w:tcBorders>
-              <w:top w:val="nil" w:sz="8" w:color="FFFFFF"/>
-              <w:left w:val="nil" w:sz="8" w:color="FFFFFF"/>
-              <w:bottom w:val="nil" w:sz="8" w:color="FFFFFF"/>
-              <w:right w:val="nil" w:sz="8" w:color="FFFFFF"/>
-            </w:tcBorders>
-            <w:vAlign w:val="center"/>
-            <w:tcMar>
-              <w:top w:w="30" w:type="dxa"/>
-              <w:bottom w:w="30" w:type="dxa"/>
-              <w:left w:w="50" w:type="dxa"/>
-              <w:right w:w="50" w:type="dxa"/>
-            </w:tcMar>
-          </w:tcPr>
-          <w:p/>
-        </w:tc>
-        <w:tc>
-          <w:tcPr>
-            <w:tcW w:type="dxa" w:w="4309"/>
-            <w:shd w:val="clear" w:color="auto" w:fill="FFFFFF"/>
-            <w:tcBorders>
-              <w:top w:val="nil" w:sz="8" w:color="FFFFFF"/>
-              <w:left w:val="nil" w:sz="8" w:color="FFFFFF"/>
-              <w:bottom w:val="nil" w:sz="8" w:color="FFFFFF"/>
-              <w:right w:val="nil" w:sz="8" w:color="FFFFFF"/>
-            </w:tcBorders>
-            <w:vAlign w:val="center"/>
-            <w:tcMar>
-              <w:top w:w="30" w:type="dxa"/>
-              <w:bottom w:w="30" w:type="dxa"/>
-              <w:left w:w="50" w:type="dxa"/>
-              <w:right w:w="50" w:type="dxa"/>
-            </w:tcMar>
-          </w:tcPr>
-          <w:p>
-            <w:pPr>
-              <w:ind w:firstLine="0" w:left="0"/>
-              <w:jc w:val="center"/>
-            </w:pPr>
-            <w:r>
-              <w:rPr>
-                <w:rFonts w:ascii="Arial" w:hAnsi="Arial"/>
-                <w:sz w:val="20"/>
-              </w:rPr>
-              <w:t>↓</w:t>
-            </w:r>
-          </w:p>
-        </w:tc>
-      </w:tr>
-      <w:tr>
-        <w:trPr>
-          <w:cantSplit/>
-        </w:trPr>
-        <w:tc>
-          <w:tcPr>
-            <w:tcW w:type="dxa" w:w="9072"/>
-            <w:gridSpan w:val="3"/>
-            <w:shd w:val="clear" w:color="auto" w:fill="54278F"/>
-            <w:tcBorders>
-              <w:top w:val="single" w:sz="8" w:color="7F7F7F"/>
-              <w:left w:val="single" w:sz="8" w:color="7F7F7F"/>
-              <w:bottom w:val="single" w:sz="8" w:color="7F7F7F"/>
-              <w:right w:val="single" w:sz="8" w:color="7F7F7F"/>
-            </w:tcBorders>
-            <w:vAlign w:val="center"/>
-            <w:tcMar>
-              <w:top w:w="30" w:type="dxa"/>
-              <w:bottom w:w="30" w:type="dxa"/>
-              <w:left w:w="50" w:type="dxa"/>
-              <w:right w:w="50" w:type="dxa"/>
-            </w:tcMar>
-          </w:tcPr>
-          <w:p>
-            <w:pPr>
-              <w:spacing w:after="0" w:before="0" w:line="240" w:lineRule="auto"/>
-              <w:ind w:firstLine="0" w:left="0"/>
-              <w:jc w:val="center"/>
-            </w:pPr>
-            <w:r>
-              <w:rPr>
-                <w:rFonts w:ascii="Arial" w:hAnsi="Arial"/>
-                <w:b/>
-                <w:color w:val="FFFFFF"/>
-                <w:sz w:val="16"/>
-              </w:rPr>
-              <w:t>3. Ajuste pelo indicador: K = cota do município × (1 + PCM) − unidades da etapa prévia</w:t>
-            </w:r>
-          </w:p>
-        </w:tc>
-      </w:tr>
-      <w:tr>
-        <w:trPr>
-          <w:cantSplit/>
-        </w:trPr>
-        <w:tc>
-          <w:tcPr>
-            <w:tcW w:type="dxa" w:w="4309"/>
-            <w:shd w:val="clear" w:color="auto" w:fill="FFFFFF"/>
-            <w:tcBorders>
-              <w:top w:val="nil" w:sz="8" w:color="FFFFFF"/>
-              <w:left w:val="nil" w:sz="8" w:color="FFFFFF"/>
-              <w:bottom w:val="nil" w:sz="8" w:color="FFFFFF"/>
-              <w:right w:val="nil" w:sz="8" w:color="FFFFFF"/>
-            </w:tcBorders>
-            <w:vAlign w:val="center"/>
-            <w:tcMar>
-              <w:top w:w="30" w:type="dxa"/>
-              <w:bottom w:w="30" w:type="dxa"/>
-              <w:left w:w="50" w:type="dxa"/>
-              <w:right w:w="50" w:type="dxa"/>
-            </w:tcMar>
-          </w:tcPr>
-          <w:p/>
-        </w:tc>
-        <w:tc>
-          <w:tcPr>
-            <w:tcW w:type="dxa" w:w="453"/>
-            <w:shd w:val="clear" w:color="auto" w:fill="FFFFFF"/>
-            <w:tcBorders>
-              <w:top w:val="nil" w:sz="8" w:color="FFFFFF"/>
-              <w:left w:val="nil" w:sz="8" w:color="FFFFFF"/>
-              <w:bottom w:val="nil" w:sz="8" w:color="FFFFFF"/>
-              <w:right w:val="nil" w:sz="8" w:color="FFFFFF"/>
-            </w:tcBorders>
-            <w:vAlign w:val="center"/>
-            <w:tcMar>
-              <w:top w:w="30" w:type="dxa"/>
-              <w:bottom w:w="30" w:type="dxa"/>
-              <w:left w:w="50" w:type="dxa"/>
-              <w:right w:w="50" w:type="dxa"/>
-            </w:tcMar>
-          </w:tcPr>
-          <w:p>
-            <w:pPr>
-              <w:ind w:firstLine="0" w:left="0"/>
-              <w:jc w:val="center"/>
-            </w:pPr>
-            <w:r>
-              <w:rPr>
-                <w:rFonts w:ascii="Arial" w:hAnsi="Arial"/>
-                <w:sz w:val="20"/>
-              </w:rPr>
-              <w:t>↓</w:t>
-            </w:r>
-          </w:p>
-        </w:tc>
-        <w:tc>
-          <w:tcPr>
-            <w:tcW w:type="dxa" w:w="4309"/>
-            <w:shd w:val="clear" w:color="auto" w:fill="FFFFFF"/>
-            <w:tcBorders>
-              <w:top w:val="nil" w:sz="8" w:color="FFFFFF"/>
-              <w:left w:val="nil" w:sz="8" w:color="FFFFFF"/>
-              <w:bottom w:val="nil" w:sz="8" w:color="FFFFFF"/>
-              <w:right w:val="nil" w:sz="8" w:color="FFFFFF"/>
-            </w:tcBorders>
-            <w:vAlign w:val="center"/>
-            <w:tcMar>
-              <w:top w:w="30" w:type="dxa"/>
-              <w:bottom w:w="30" w:type="dxa"/>
-              <w:left w:w="50" w:type="dxa"/>
-              <w:right w:w="50" w:type="dxa"/>
-            </w:tcMar>
-          </w:tcPr>
-          <w:p/>
-        </w:tc>
-      </w:tr>
-      <w:tr>
-        <w:trPr>
-          <w:cantSplit/>
-        </w:trPr>
-        <w:tc>
-          <w:tcPr>
-            <w:tcW w:type="dxa" w:w="4309"/>
-            <w:shd w:val="clear" w:color="auto" w:fill="FFFFFF"/>
-            <w:tcBorders>
-              <w:top w:val="single" w:sz="8" w:color="595959"/>
-              <w:left w:val="single" w:sz="8" w:color="595959"/>
-              <w:bottom w:val="single" w:sz="8" w:color="595959"/>
-              <w:right w:val="single" w:sz="8" w:color="595959"/>
-            </w:tcBorders>
-            <w:vAlign w:val="center"/>
-            <w:tcMar>
-              <w:top w:w="30" w:type="dxa"/>
-              <w:bottom w:w="30" w:type="dxa"/>
-              <w:left w:w="50" w:type="dxa"/>
-              <w:right w:w="50" w:type="dxa"/>
-            </w:tcMar>
-          </w:tcPr>
-          <w:p>
-            <w:pPr>
-              <w:spacing w:after="0" w:before="0" w:line="240" w:lineRule="auto"/>
-              <w:ind w:firstLine="0" w:left="0"/>
-              <w:jc w:val="center"/>
-            </w:pPr>
-            <w:r>
-              <w:rPr>
-                <w:rFonts w:ascii="Arial" w:hAnsi="Arial"/>
-                <w:b w:val="0"/>
-                <w:color w:val="000000"/>
-                <w:sz w:val="16"/>
-              </w:rPr>
-              <w:t>4. Parte inteira de K atribuída de imediato (90 unidades)</w:t>
-            </w:r>
-          </w:p>
-        </w:tc>
-        <w:tc>
-          <w:tcPr>
-            <w:tcW w:type="dxa" w:w="453"/>
-            <w:shd w:val="clear" w:color="auto" w:fill="FFFFFF"/>
-            <w:tcBorders>
-              <w:top w:val="nil" w:sz="8" w:color="FFFFFF"/>
-              <w:left w:val="nil" w:sz="8" w:color="FFFFFF"/>
-              <w:bottom w:val="nil" w:sz="8" w:color="FFFFFF"/>
-              <w:right w:val="nil" w:sz="8" w:color="FFFFFF"/>
-            </w:tcBorders>
-            <w:vAlign w:val="center"/>
-            <w:tcMar>
-              <w:top w:w="30" w:type="dxa"/>
-              <w:bottom w:w="30" w:type="dxa"/>
-              <w:left w:w="50" w:type="dxa"/>
-              <w:right w:w="50" w:type="dxa"/>
-            </w:tcMar>
-          </w:tcPr>
-          <w:p>
-            <w:pPr>
-              <w:ind w:firstLine="0" w:left="0"/>
-              <w:jc w:val="center"/>
-            </w:pPr>
-            <w:r>
-              <w:rPr>
-                <w:rFonts w:ascii="Arial" w:hAnsi="Arial"/>
-                <w:sz w:val="20"/>
-              </w:rPr>
-              <w:t>→</w:t>
-            </w:r>
-          </w:p>
-        </w:tc>
-        <w:tc>
-          <w:tcPr>
-            <w:tcW w:type="dxa" w:w="4309"/>
-            <w:shd w:val="clear" w:color="auto" w:fill="FFFFFF"/>
-            <w:tcBorders>
-              <w:top w:val="single" w:sz="8" w:color="595959"/>
-              <w:left w:val="single" w:sz="8" w:color="595959"/>
-              <w:bottom w:val="single" w:sz="8" w:color="595959"/>
-              <w:right w:val="single" w:sz="8" w:color="595959"/>
-            </w:tcBorders>
-            <w:vAlign w:val="center"/>
-            <w:tcMar>
-              <w:top w:w="30" w:type="dxa"/>
-              <w:bottom w:w="30" w:type="dxa"/>
-              <w:left w:w="50" w:type="dxa"/>
-              <w:right w:w="50" w:type="dxa"/>
-            </w:tcMar>
-          </w:tcPr>
-          <w:p>
-            <w:pPr>
-              <w:spacing w:after="0" w:before="0" w:line="240" w:lineRule="auto"/>
-              <w:ind w:firstLine="0" w:left="0"/>
-              <w:jc w:val="center"/>
-            </w:pPr>
-            <w:r>
-              <w:rPr>
-                <w:rFonts w:ascii="Arial" w:hAnsi="Arial"/>
-                <w:b w:val="0"/>
-                <w:color w:val="000000"/>
-                <w:sz w:val="16"/>
-              </w:rPr>
-              <w:t>5. Maior resto: as 111 unidades restantes vão às maiores frações, uma por município</w:t>
-            </w:r>
-          </w:p>
-        </w:tc>
-      </w:tr>
-      <w:tr>
-        <w:trPr>
-          <w:cantSplit/>
-        </w:trPr>
-        <w:tc>
-          <w:tcPr>
-            <w:tcW w:type="dxa" w:w="4309"/>
-            <w:shd w:val="clear" w:color="auto" w:fill="FFFFFF"/>
-            <w:tcBorders>
-              <w:top w:val="nil" w:sz="8" w:color="FFFFFF"/>
-              <w:left w:val="nil" w:sz="8" w:color="FFFFFF"/>
-              <w:bottom w:val="nil" w:sz="8" w:color="FFFFFF"/>
-              <w:right w:val="nil" w:sz="8" w:color="FFFFFF"/>
-            </w:tcBorders>
-            <w:vAlign w:val="center"/>
-            <w:tcMar>
-              <w:top w:w="30" w:type="dxa"/>
-              <w:bottom w:w="30" w:type="dxa"/>
-              <w:left w:w="50" w:type="dxa"/>
-              <w:right w:w="50" w:type="dxa"/>
-            </w:tcMar>
-          </w:tcPr>
-          <w:p/>
-        </w:tc>
-        <w:tc>
-          <w:tcPr>
-            <w:tcW w:type="dxa" w:w="453"/>
-            <w:shd w:val="clear" w:color="auto" w:fill="FFFFFF"/>
-            <w:tcBorders>
-              <w:top w:val="nil" w:sz="8" w:color="FFFFFF"/>
-              <w:left w:val="nil" w:sz="8" w:color="FFFFFF"/>
-              <w:bottom w:val="nil" w:sz="8" w:color="FFFFFF"/>
-              <w:right w:val="nil" w:sz="8" w:color="FFFFFF"/>
-            </w:tcBorders>
-            <w:vAlign w:val="center"/>
-            <w:tcMar>
-              <w:top w:w="30" w:type="dxa"/>
-              <w:bottom w:w="30" w:type="dxa"/>
-              <w:left w:w="50" w:type="dxa"/>
-              <w:right w:w="50" w:type="dxa"/>
-            </w:tcMar>
-          </w:tcPr>
-          <w:p>
-            <w:pPr>
-              <w:ind w:firstLine="0" w:left="0"/>
-              <w:jc w:val="center"/>
-            </w:pPr>
-            <w:r>
-              <w:rPr>
-                <w:rFonts w:ascii="Arial" w:hAnsi="Arial"/>
-                <w:sz w:val="20"/>
-              </w:rPr>
-              <w:t>↓</w:t>
-            </w:r>
-          </w:p>
-        </w:tc>
-        <w:tc>
-          <w:tcPr>
-            <w:tcW w:type="dxa" w:w="4309"/>
-            <w:shd w:val="clear" w:color="auto" w:fill="FFFFFF"/>
-            <w:tcBorders>
-              <w:top w:val="nil" w:sz="8" w:color="FFFFFF"/>
-              <w:left w:val="nil" w:sz="8" w:color="FFFFFF"/>
-              <w:bottom w:val="nil" w:sz="8" w:color="FFFFFF"/>
-              <w:right w:val="nil" w:sz="8" w:color="FFFFFF"/>
-            </w:tcBorders>
-            <w:vAlign w:val="center"/>
-            <w:tcMar>
-              <w:top w:w="30" w:type="dxa"/>
-              <w:bottom w:w="30" w:type="dxa"/>
-              <w:left w:w="50" w:type="dxa"/>
-              <w:right w:w="50" w:type="dxa"/>
-            </w:tcMar>
-          </w:tcPr>
-          <w:p/>
-        </w:tc>
-      </w:tr>
-      <w:tr>
-        <w:trPr>
-          <w:cantSplit/>
-        </w:trPr>
-        <w:tc>
-          <w:tcPr>
-            <w:tcW w:type="dxa" w:w="4309"/>
-            <w:shd w:val="clear" w:color="auto" w:fill="1F1F1F"/>
-            <w:tcBorders>
-              <w:top w:val="single" w:sz="8" w:color="7F7F7F"/>
-              <w:left w:val="single" w:sz="8" w:color="7F7F7F"/>
-              <w:bottom w:val="single" w:sz="8" w:color="7F7F7F"/>
-              <w:right w:val="single" w:sz="8" w:color="7F7F7F"/>
-            </w:tcBorders>
-            <w:vAlign w:val="center"/>
-            <w:tcMar>
-              <w:top w:w="30" w:type="dxa"/>
-              <w:bottom w:w="30" w:type="dxa"/>
-              <w:left w:w="50" w:type="dxa"/>
-              <w:right w:w="50" w:type="dxa"/>
-            </w:tcMar>
-          </w:tcPr>
-          <w:p>
-            <w:pPr>
-              <w:spacing w:after="0" w:before="0" w:line="240" w:lineRule="auto"/>
-              <w:ind w:firstLine="0" w:left="0"/>
-              <w:jc w:val="center"/>
-            </w:pPr>
-            <w:r>
-              <w:rPr>
-                <w:rFonts w:ascii="Arial" w:hAnsi="Arial"/>
-                <w:b w:val="0"/>
-                <w:color w:val="FFFFFF"/>
-                <w:sz w:val="16"/>
-              </w:rPr>
-              <w:t>6a. Portes grandes (30 municípios): teto por município de 10, 8, 7, 4 e 2; de 142 para 100 unidades</w:t>
-            </w:r>
-          </w:p>
-        </w:tc>
-        <w:tc>
-          <w:tcPr>
-            <w:tcW w:type="dxa" w:w="453"/>
-            <w:shd w:val="clear" w:color="auto" w:fill="FFFFFF"/>
-            <w:tcBorders>
-              <w:top w:val="nil" w:sz="8" w:color="FFFFFF"/>
-              <w:left w:val="nil" w:sz="8" w:color="FFFFFF"/>
-              <w:bottom w:val="nil" w:sz="8" w:color="FFFFFF"/>
-              <w:right w:val="nil" w:sz="8" w:color="FFFFFF"/>
-            </w:tcBorders>
-            <w:vAlign w:val="center"/>
-            <w:tcMar>
-              <w:top w:w="30" w:type="dxa"/>
-              <w:bottom w:w="30" w:type="dxa"/>
-              <w:left w:w="50" w:type="dxa"/>
-              <w:right w:w="50" w:type="dxa"/>
-            </w:tcMar>
-          </w:tcPr>
-          <w:p/>
-        </w:tc>
-        <w:tc>
-          <w:tcPr>
-            <w:tcW w:type="dxa" w:w="4309"/>
-            <w:shd w:val="clear" w:color="auto" w:fill="1F1F1F"/>
-            <w:tcBorders>
-              <w:top w:val="single" w:sz="8" w:color="7F7F7F"/>
-              <w:left w:val="single" w:sz="8" w:color="7F7F7F"/>
-              <w:bottom w:val="single" w:sz="8" w:color="7F7F7F"/>
-              <w:right w:val="single" w:sz="8" w:color="7F7F7F"/>
-            </w:tcBorders>
-            <w:vAlign w:val="center"/>
-            <w:tcMar>
-              <w:top w:w="30" w:type="dxa"/>
-              <w:bottom w:w="30" w:type="dxa"/>
-              <w:left w:w="50" w:type="dxa"/>
-              <w:right w:w="50" w:type="dxa"/>
-            </w:tcMar>
-          </w:tcPr>
-          <w:p>
-            <w:pPr>
-              <w:spacing w:after="0" w:before="0" w:line="240" w:lineRule="auto"/>
-              <w:ind w:firstLine="0" w:left="0"/>
-              <w:jc w:val="center"/>
-            </w:pPr>
-            <w:r>
-              <w:rPr>
-                <w:rFonts w:ascii="Arial" w:hAnsi="Arial"/>
-                <w:b w:val="0"/>
-                <w:color w:val="FFFFFF"/>
-                <w:sz w:val="16"/>
-              </w:rPr>
-              <w:t>6b. Portes pequenos (369 municípios): uma unidade aos 27, 100 e 30 municípios de maior PCM de cada faixa (157 unidades)</w:t>
-            </w:r>
-          </w:p>
-        </w:tc>
-      </w:tr>
-      <w:tr>
-        <w:trPr>
-          <w:cantSplit/>
-        </w:trPr>
-        <w:tc>
-          <w:tcPr>
-            <w:tcW w:type="dxa" w:w="4309"/>
-            <w:shd w:val="clear" w:color="auto" w:fill="FFFFFF"/>
-            <w:tcBorders>
-              <w:top w:val="nil" w:sz="8" w:color="FFFFFF"/>
-              <w:left w:val="nil" w:sz="8" w:color="FFFFFF"/>
-              <w:bottom w:val="nil" w:sz="8" w:color="FFFFFF"/>
-              <w:right w:val="nil" w:sz="8" w:color="FFFFFF"/>
-            </w:tcBorders>
-            <w:vAlign w:val="center"/>
-            <w:tcMar>
-              <w:top w:w="30" w:type="dxa"/>
-              <w:bottom w:w="30" w:type="dxa"/>
-              <w:left w:w="50" w:type="dxa"/>
-              <w:right w:w="50" w:type="dxa"/>
-            </w:tcMar>
-          </w:tcPr>
-          <w:p/>
-        </w:tc>
-        <w:tc>
-          <w:tcPr>
-            <w:tcW w:type="dxa" w:w="453"/>
-            <w:shd w:val="clear" w:color="auto" w:fill="FFFFFF"/>
-            <w:tcBorders>
-              <w:top w:val="nil" w:sz="8" w:color="FFFFFF"/>
-              <w:left w:val="nil" w:sz="8" w:color="FFFFFF"/>
-              <w:bottom w:val="nil" w:sz="8" w:color="FFFFFF"/>
-              <w:right w:val="nil" w:sz="8" w:color="FFFFFF"/>
-            </w:tcBorders>
-            <w:vAlign w:val="center"/>
-            <w:tcMar>
-              <w:top w:w="30" w:type="dxa"/>
-              <w:bottom w:w="30" w:type="dxa"/>
-              <w:left w:w="50" w:type="dxa"/>
-              <w:right w:w="50" w:type="dxa"/>
-            </w:tcMar>
-          </w:tcPr>
-          <w:p>
-            <w:pPr>
-              <w:ind w:firstLine="0" w:left="0"/>
-              <w:jc w:val="center"/>
-            </w:pPr>
-            <w:r>
-              <w:rPr>
-                <w:rFonts w:ascii="Arial" w:hAnsi="Arial"/>
-                <w:sz w:val="20"/>
-              </w:rPr>
-              <w:t>↓</w:t>
-            </w:r>
-          </w:p>
-        </w:tc>
-        <w:tc>
-          <w:tcPr>
-            <w:tcW w:type="dxa" w:w="4309"/>
-            <w:shd w:val="clear" w:color="auto" w:fill="FFFFFF"/>
-            <w:tcBorders>
-              <w:top w:val="nil" w:sz="8" w:color="FFFFFF"/>
-              <w:left w:val="nil" w:sz="8" w:color="FFFFFF"/>
-              <w:bottom w:val="nil" w:sz="8" w:color="FFFFFF"/>
-              <w:right w:val="nil" w:sz="8" w:color="FFFFFF"/>
-            </w:tcBorders>
-            <w:vAlign w:val="center"/>
-            <w:tcMar>
-              <w:top w:w="30" w:type="dxa"/>
-              <w:bottom w:w="30" w:type="dxa"/>
-              <w:left w:w="50" w:type="dxa"/>
-              <w:right w:w="50" w:type="dxa"/>
-            </w:tcMar>
-          </w:tcPr>
-          <w:p/>
-        </w:tc>
-      </w:tr>
-      <w:tr>
-        <w:trPr>
-          <w:cantSplit/>
-        </w:trPr>
-        <w:tc>
-          <w:tcPr>
-            <w:tcW w:type="dxa" w:w="9072"/>
-            <w:gridSpan w:val="3"/>
-            <w:shd w:val="clear" w:color="auto" w:fill="FFFFFF"/>
-            <w:tcBorders>
-              <w:top w:val="single" w:sz="8" w:color="000000"/>
-              <w:left w:val="single" w:sz="8" w:color="000000"/>
-              <w:bottom w:val="single" w:sz="8" w:color="000000"/>
-              <w:right w:val="single" w:sz="8" w:color="000000"/>
-            </w:tcBorders>
-            <w:vAlign w:val="center"/>
-            <w:tcMar>
-              <w:top w:w="30" w:type="dxa"/>
-              <w:bottom w:w="30" w:type="dxa"/>
-              <w:left w:w="50" w:type="dxa"/>
-              <w:right w:w="50" w:type="dxa"/>
-            </w:tcMar>
-          </w:tcPr>
-          <w:p>
-            <w:pPr>
-              <w:spacing w:after="0" w:before="0" w:line="240" w:lineRule="auto"/>
-              <w:ind w:firstLine="0" w:left="0"/>
-              <w:jc w:val="center"/>
-            </w:pPr>
-            <w:r>
-              <w:rPr>
-                <w:rFonts w:ascii="Arial" w:hAnsi="Arial"/>
-                <w:b/>
-                <w:color w:val="000000"/>
-                <w:sz w:val="16"/>
-              </w:rPr>
-              <w:t>Resultado: 43 + 100 + 157 = 300 unidades; tetos menores em maio de 2024 (300 em 258 municípios); Resolução 219/2024: 303 em 261</w:t>
-            </w:r>
-          </w:p>
-        </w:tc>
-      </w:tr>
-    </w:tbl>
     <w:p>
       <w:pPr>
         <w:keepNext w:val="0"/>
-        <w:spacing w:line="240" w:lineRule="auto" w:after="120" w:before="60"/>
-        <w:ind w:firstLine="0"/>
-        <w:jc w:val="left"/>
+        <w:spacing w:line="360" w:lineRule="auto" w:after="0" w:before="0"/>
+        <w:ind w:firstLine="850"/>
+        <w:jc w:val="both"/>
       </w:pPr>
       <w:r>
         <w:rPr>
           <w:rFonts w:ascii="Arial" w:hAnsi="Arial"/>
           <w:b w:val="0"/>
           <w:i w:val="0"/>
-          <w:sz w:val="20"/>
+          <w:sz w:val="24"/>
         </w:rPr>
-        <w:t>Fonte: Elaboração própria a partir das planilhas do estudo (abas Metodologia e Dados) e de Paraná (2024a).</w:t>
+        <w:t>Nos municípios pequenos não há cálculo proporcional. Em cada uma das três faixas inferiores, os municípios são ordenados pelo PCM, excluídos os da etapa prévia, e os primeiros da fila recebem uma unidade: 27 dos 62 municípios de 20 a 70 mil habitantes, 100 dos 205 de 5 a 20 mil e 30 dos 102 com até 5 mil, o que soma 157 unidades. O PCM do último contemplado é a linha de corte da faixa; abaixo dela, os demais permanecem na ordem do índice, como suplentes.</w:t>
+      </w:r>
+    </w:p>
+    <w:p>
+      <w:pPr>
+        <w:keepNext w:val="0"/>
+        <w:spacing w:line="360" w:lineRule="auto" w:after="0" w:before="0"/>
+        <w:ind w:firstLine="850"/>
+        <w:jc w:val="both"/>
+      </w:pPr>
+      <w:r>
+        <w:rPr>
+          <w:rFonts w:ascii="Arial" w:hAnsi="Arial"/>
+          <w:b w:val="0"/>
+          <w:i w:val="0"/>
+          <w:sz w:val="24"/>
+        </w:rPr>
+        <w:t>Os três blocos somam 300 unidades, em 224 municípios, na versão de março de 2024. A versão apresentada ao conselho em maio manteve o índice e as cotas e reduziu os tetos dos municípios grandes, o que deslocou 38 unidades para as faixas inferiores e elevou o alcance para 258 municípios. A Resolução SEDEF nº 219/2024 acrescentou uma unidade a três municípios e publicou 303 unidades em 261 municípios.</w:t>
       </w:r>
     </w:p>
     <w:p>

</xml_diff>